<commit_message>
Add second automobile dialogues and cases
</commit_message>
<xml_diff>
--- a/18_DOCX/AUTO_INDEX_0001.docx
+++ b/18_DOCX/AUTO_INDEX_0001.docx
@@ -342,6 +342,86 @@
     </w:p>
     <w:p>
       <w:pPr>
+        <w:pStyle w:val="ListBullet"/>
+      </w:pPr>
+      <w:r>
+        <w:t>AUTO-0011 - 自賠責保険 - Seguro obrigatório de responsabilidade civil automóvel</w:t>
+      </w:r>
+    </w:p>
+    <w:p>
+      <w:pPr>
+        <w:pStyle w:val="ListBullet"/>
+      </w:pPr>
+      <w:r>
+        <w:t>AUTO-0012 - 任意保険 - Seguro voluntário de automóvel</w:t>
+      </w:r>
+    </w:p>
+    <w:p>
+      <w:pPr>
+        <w:pStyle w:val="ListBullet"/>
+      </w:pPr>
+      <w:r>
+        <w:t>AUTO-0013 - ロードサービス - Assistência na estrada</w:t>
+      </w:r>
+    </w:p>
+    <w:p>
+      <w:pPr>
+        <w:pStyle w:val="ListBullet"/>
+      </w:pPr>
+      <w:r>
+        <w:t>AUTO-0014 - 弁護士費用特約 - Cobertura adicional de honorários advocatícios</w:t>
+      </w:r>
+    </w:p>
+    <w:p>
+      <w:pPr>
+        <w:pStyle w:val="ListBullet"/>
+      </w:pPr>
+      <w:r>
+        <w:t>AUTO-0015 - 代車費用特約 - Cobertura adicional de carro substituto</w:t>
+      </w:r>
+    </w:p>
+    <w:p>
+      <w:pPr>
+        <w:pStyle w:val="ListBullet"/>
+      </w:pPr>
+      <w:r>
+        <w:t>AUTO-0016 - 運転者限定 - Restrição de condutores</w:t>
+      </w:r>
+    </w:p>
+    <w:p>
+      <w:pPr>
+        <w:pStyle w:val="ListBullet"/>
+      </w:pPr>
+      <w:r>
+        <w:t>AUTO-0017 - 年齢条件 - Condição de idade do condutor</w:t>
+      </w:r>
+    </w:p>
+    <w:p>
+      <w:pPr>
+        <w:pStyle w:val="ListBullet"/>
+      </w:pPr>
+      <w:r>
+        <w:t>AUTO-0018 - 使用目的 - Finalidade de uso do veículo</w:t>
+      </w:r>
+    </w:p>
+    <w:p>
+      <w:pPr>
+        <w:pStyle w:val="ListBullet"/>
+      </w:pPr>
+      <w:r>
+        <w:t>AUTO-0019 - 事故受付 - Registro de aviso de acidente</w:t>
+      </w:r>
+    </w:p>
+    <w:p>
+      <w:pPr>
+        <w:pStyle w:val="ListBullet"/>
+      </w:pPr>
+      <w:r>
+        <w:t>AUTO-0020 - 交通事故証明書 - Certificado de acidente de trânsito</w:t>
+      </w:r>
+    </w:p>
+    <w:p>
+      <w:pPr>
         <w:pStyle w:val="Heading3"/>
       </w:pPr>
       <w:r>
@@ -430,6 +510,86 @@
     </w:p>
     <w:p>
       <w:pPr>
+        <w:pStyle w:val="ListBullet"/>
+      </w:pPr>
+      <w:r>
+        <w:t>FAQ-AUTO-0011 - Qual é a diferença entre 自賠責保険 e 任意保険?</w:t>
+      </w:r>
+    </w:p>
+    <w:p>
+      <w:pPr>
+        <w:pStyle w:val="ListBullet"/>
+      </w:pPr>
+      <w:r>
+        <w:t>FAQ-AUTO-0012 - O seguro obrigatório é suficiente?</w:t>
+      </w:r>
+    </w:p>
+    <w:p>
+      <w:pPr>
+        <w:pStyle w:val="ListBullet"/>
+      </w:pPr>
+      <w:r>
+        <w:t>FAQ-AUTO-0013 - Quando posso usar o serviço de assistência na estrada?</w:t>
+      </w:r>
+    </w:p>
+    <w:p>
+      <w:pPr>
+        <w:pStyle w:val="ListBullet"/>
+      </w:pPr>
+      <w:r>
+        <w:t>FAQ-AUTO-0014 - Para que serve a cobertura de advogado?</w:t>
+      </w:r>
+    </w:p>
+    <w:p>
+      <w:pPr>
+        <w:pStyle w:val="ListBullet"/>
+      </w:pPr>
+      <w:r>
+        <w:t>FAQ-AUTO-0015 - Quando tenho direito a carro substituto?</w:t>
+      </w:r>
+    </w:p>
+    <w:p>
+      <w:pPr>
+        <w:pStyle w:val="ListBullet"/>
+      </w:pPr>
+      <w:r>
+        <w:t>FAQ-AUTO-0016 - Quem pode dirigir o carro segurado?</w:t>
+      </w:r>
+    </w:p>
+    <w:p>
+      <w:pPr>
+        <w:pStyle w:val="ListBullet"/>
+      </w:pPr>
+      <w:r>
+        <w:t>FAQ-AUTO-0017 - A idade do motorista muda o preço do seguro?</w:t>
+      </w:r>
+    </w:p>
+    <w:p>
+      <w:pPr>
+        <w:pStyle w:val="ListBullet"/>
+      </w:pPr>
+      <w:r>
+        <w:t>FAQ-AUTO-0018 - Por que preciso informar a finalidade de uso do carro?</w:t>
+      </w:r>
+    </w:p>
+    <w:p>
+      <w:pPr>
+        <w:pStyle w:val="ListBullet"/>
+      </w:pPr>
+      <w:r>
+        <w:t>FAQ-AUTO-0019 - O que devo fazer logo após um acidente?</w:t>
+      </w:r>
+    </w:p>
+    <w:p>
+      <w:pPr>
+        <w:pStyle w:val="ListBullet"/>
+      </w:pPr>
+      <w:r>
+        <w:t>FAQ-AUTO-0020 - Para que serve o certificado de acidente de trânsito?</w:t>
+      </w:r>
+    </w:p>
+    <w:p>
+      <w:pPr>
         <w:pStyle w:val="Heading3"/>
       </w:pPr>
       <w:r>
@@ -470,6 +630,38 @@
     </w:p>
     <w:p>
       <w:pPr>
+        <w:pStyle w:val="ListBullet"/>
+      </w:pPr>
+      <w:r>
+        <w:t>DIALOGUE-AUTO-0005 - Explicando seguro obrigatório e seguro voluntário</w:t>
+      </w:r>
+    </w:p>
+    <w:p>
+      <w:pPr>
+        <w:pStyle w:val="ListBullet"/>
+      </w:pPr>
+      <w:r>
+        <w:t>DIALOGUE-AUTO-0006 - Explicando assistência na estrada e carro substituto</w:t>
+      </w:r>
+    </w:p>
+    <w:p>
+      <w:pPr>
+        <w:pStyle w:val="ListBullet"/>
+      </w:pPr>
+      <w:r>
+        <w:t>DIALOGUE-AUTO-0007 - Explicando restrição de condutores e condição de idade</w:t>
+      </w:r>
+    </w:p>
+    <w:p>
+      <w:pPr>
+        <w:pStyle w:val="ListBullet"/>
+      </w:pPr>
+      <w:r>
+        <w:t>DIALOGUE-AUTO-0008 - Orientando cliente após acidente</w:t>
+      </w:r>
+    </w:p>
+    <w:p>
+      <w:pPr>
         <w:pStyle w:val="Heading3"/>
       </w:pPr>
       <w:r>
@@ -538,6 +730,38 @@
       </w:pPr>
       <w:r>
         <w:t>CASE-AUTO-0008 - Cliente pergunta quando receberá a indenização</w:t>
+      </w:r>
+    </w:p>
+    <w:p>
+      <w:pPr>
+        <w:pStyle w:val="ListBullet"/>
+      </w:pPr>
+      <w:r>
+        <w:t>CASE-AUTO-0009 - Cliente acha que 自賠責保険 cobre todos os prejuízos</w:t>
+      </w:r>
+    </w:p>
+    <w:p>
+      <w:pPr>
+        <w:pStyle w:val="ListBullet"/>
+      </w:pPr>
+      <w:r>
+        <w:t>CASE-AUTO-0010 - Pane na estrada e uso de ロードサービス</w:t>
+      </w:r>
+    </w:p>
+    <w:p>
+      <w:pPr>
+        <w:pStyle w:val="ListBullet"/>
+      </w:pPr>
+      <w:r>
+        <w:t>CASE-AUTO-0011 - Acidente com motorista fora da restrição de condutores</w:t>
+      </w:r>
+    </w:p>
+    <w:p>
+      <w:pPr>
+        <w:pStyle w:val="ListBullet"/>
+      </w:pPr>
+      <w:r>
+        <w:t>CASE-AUTO-0012 - Cliente precisa de 交通事故証明書 após colisão</w:t>
       </w:r>
     </w:p>
     <w:p>
@@ -552,7 +776,7 @@
       <w:r>
         <w:rPr>
           <w:rFonts w:ascii="Courier New" w:hAnsi="Courier New"/>
-          <w:sz w:val="16"/>
+          <w:sz w:val="15"/>
         </w:rPr>
         <w:t>| Tema | Verbetes | FAQs | Diálogos | Casos |</w:t>
       </w:r>
@@ -561,7 +785,7 @@
       <w:r>
         <w:rPr>
           <w:rFonts w:ascii="Courier New" w:hAnsi="Courier New"/>
-          <w:sz w:val="16"/>
+          <w:sz w:val="15"/>
         </w:rPr>
         <w:t>| --- | --- | --- | --- | --- |</w:t>
       </w:r>
@@ -570,7 +794,7 @@
       <w:r>
         <w:rPr>
           <w:rFonts w:ascii="Courier New" w:hAnsi="Courier New"/>
-          <w:sz w:val="16"/>
+          <w:sz w:val="15"/>
         </w:rPr>
         <w:t>| Cobertura geral | AUTO-0001 | FAQ-AUTO-0001 | DIALOGUE-AUTO-0001 | CASE-AUTO-0001 |</w:t>
       </w:r>
@@ -579,7 +803,7 @@
       <w:r>
         <w:rPr>
           <w:rFonts w:ascii="Courier New" w:hAnsi="Courier New"/>
-          <w:sz w:val="16"/>
+          <w:sz w:val="15"/>
         </w:rPr>
         <w:t>| Danos pessoais a terceiros | AUTO-0002 | FAQ-AUTO-0002 | DIALOGUE-AUTO-0001 | CASE-AUTO-0002 |</w:t>
       </w:r>
@@ -588,7 +812,7 @@
       <w:r>
         <w:rPr>
           <w:rFonts w:ascii="Courier New" w:hAnsi="Courier New"/>
-          <w:sz w:val="16"/>
+          <w:sz w:val="15"/>
         </w:rPr>
         <w:t>| Danos materiais a terceiros | AUTO-0003 | FAQ-AUTO-0003 | DIALOGUE-AUTO-0001 | CASE-AUTO-0003 |</w:t>
       </w:r>
@@ -597,7 +821,7 @@
       <w:r>
         <w:rPr>
           <w:rFonts w:ascii="Courier New" w:hAnsi="Courier New"/>
-          <w:sz w:val="16"/>
+          <w:sz w:val="15"/>
         </w:rPr>
         <w:t>| Próprio veículo | AUTO-0004 | FAQ-AUTO-0004 | DIALOGUE-AUTO-0002 | CASE-AUTO-0004 |</w:t>
       </w:r>
@@ -606,7 +830,7 @@
       <w:r>
         <w:rPr>
           <w:rFonts w:ascii="Courier New" w:hAnsi="Courier New"/>
-          <w:sz w:val="16"/>
+          <w:sz w:val="15"/>
         </w:rPr>
         <w:t>| Pessoas no veículo | AUTO-0005, AUTO-0006 | FAQ-AUTO-0005, FAQ-AUTO-0006 | DIALOGUE-AUTO-0002 | CASE-AUTO-0005 |</w:t>
       </w:r>
@@ -615,7 +839,7 @@
       <w:r>
         <w:rPr>
           <w:rFonts w:ascii="Courier New" w:hAnsi="Courier New"/>
-          <w:sz w:val="16"/>
+          <w:sz w:val="15"/>
         </w:rPr>
         <w:t>| Franquia | AUTO-0007 | FAQ-AUTO-0007 | DIALOGUE-AUTO-0003 | CASE-AUTO-0006 |</w:t>
       </w:r>
@@ -624,7 +848,7 @@
       <w:r>
         <w:rPr>
           <w:rFonts w:ascii="Courier New" w:hAnsi="Courier New"/>
-          <w:sz w:val="16"/>
+          <w:sz w:val="15"/>
         </w:rPr>
         <w:t>| Classe e preço | AUTO-0008, AUTO-0009 | FAQ-AUTO-0008, FAQ-AUTO-0009 | DIALOGUE-AUTO-0003 | CASE-AUTO-0007 |</w:t>
       </w:r>
@@ -633,12 +857,57 @@
       <w:r>
         <w:rPr>
           <w:rFonts w:ascii="Courier New" w:hAnsi="Courier New"/>
-          <w:sz w:val="16"/>
+          <w:sz w:val="15"/>
         </w:rPr>
         <w:t>| Indenização | AUTO-0010 | FAQ-AUTO-0010 | DIALOGUE-AUTO-0004 | CASE-AUTO-0008 |</w:t>
       </w:r>
     </w:p>
     <w:p>
+      <w:r>
+        <w:rPr>
+          <w:rFonts w:ascii="Courier New" w:hAnsi="Courier New"/>
+          <w:sz w:val="15"/>
+        </w:rPr>
+        <w:t>| Seguro obrigatório e voluntário | AUTO-0011, AUTO-0012 | FAQ-AUTO-0011, FAQ-AUTO-0012 | DIALOGUE-AUTO-0005 | CASE-AUTO-0009 |</w:t>
+      </w:r>
+    </w:p>
+    <w:p>
+      <w:r>
+        <w:rPr>
+          <w:rFonts w:ascii="Courier New" w:hAnsi="Courier New"/>
+          <w:sz w:val="15"/>
+        </w:rPr>
+        <w:t>| Assistência e carro substituto | AUTO-0013, AUTO-0015 | FAQ-AUTO-0013, FAQ-AUTO-0015 | DIALOGUE-AUTO-0006 | CASE-AUTO-0010 |</w:t>
+      </w:r>
+    </w:p>
+    <w:p>
+      <w:r>
+        <w:rPr>
+          <w:rFonts w:ascii="Courier New" w:hAnsi="Courier New"/>
+          <w:sz w:val="15"/>
+        </w:rPr>
+        <w:t>| Cobertura de advogado | AUTO-0014 | FAQ-AUTO-0014 | DIALOGUE-AUTO-0008 | CASE-AUTO-0012 |</w:t>
+      </w:r>
+    </w:p>
+    <w:p>
+      <w:r>
+        <w:rPr>
+          <w:rFonts w:ascii="Courier New" w:hAnsi="Courier New"/>
+          <w:sz w:val="15"/>
+        </w:rPr>
+        <w:t>| Condutores, idade e uso | AUTO-0016, AUTO-0017, AUTO-0018 | FAQ-AUTO-0016, FAQ-AUTO-0017, FAQ-AUTO-0018 | DIALOGUE-AUTO-0007 | CASE-AUTO-0011 |</w:t>
+      </w:r>
+    </w:p>
+    <w:p>
+      <w:r>
+        <w:rPr>
+          <w:rFonts w:ascii="Courier New" w:hAnsi="Courier New"/>
+          <w:sz w:val="15"/>
+        </w:rPr>
+        <w:t>| Aviso e certificado de acidente | AUTO-0019, AUTO-0020 | FAQ-AUTO-0019, FAQ-AUTO-0020 | DIALOGUE-AUTO-0008 | CASE-AUTO-0012 |</w:t>
+      </w:r>
+    </w:p>
+    <w:p>
       <w:pPr>
         <w:pStyle w:val="Heading2"/>
       </w:pPr>
@@ -732,6 +1001,38 @@
       </w:pPr>
       <w:r>
         <w:t>`19_Markdown/AUTO/AUTO_CASES_0001_0008.md`</w:t>
+      </w:r>
+    </w:p>
+    <w:p>
+      <w:pPr>
+        <w:pStyle w:val="ListBullet"/>
+      </w:pPr>
+      <w:r>
+        <w:t>`19_Markdown/AUTO/AUTO_TERMS_0011_0020.md`</w:t>
+      </w:r>
+    </w:p>
+    <w:p>
+      <w:pPr>
+        <w:pStyle w:val="ListBullet"/>
+      </w:pPr>
+      <w:r>
+        <w:t>`19_Markdown/AUTO/AUTO_FAQ_0011_0020.md`</w:t>
+      </w:r>
+    </w:p>
+    <w:p>
+      <w:pPr>
+        <w:pStyle w:val="ListBullet"/>
+      </w:pPr>
+      <w:r>
+        <w:t>`19_Markdown/AUTO/AUTO_DIALOGUES_0005_0008.md`</w:t>
+      </w:r>
+    </w:p>
+    <w:p>
+      <w:pPr>
+        <w:pStyle w:val="ListBullet"/>
+      </w:pPr>
+      <w:r>
+        <w:t>`19_Markdown/AUTO/AUTO_CASES_0009_0012.md`</w:t>
       </w:r>
     </w:p>
     <w:p>
@@ -746,7 +1047,7 @@
       <w:r>
         <w:rPr>
           <w:rFonts w:ascii="Courier New" w:hAnsi="Courier New"/>
-          <w:sz w:val="16"/>
+          <w:sz w:val="15"/>
         </w:rPr>
         <w:t>| Data | Versão | Autor | Alteração |</w:t>
       </w:r>
@@ -755,7 +1056,7 @@
       <w:r>
         <w:rPr>
           <w:rFonts w:ascii="Courier New" w:hAnsi="Courier New"/>
-          <w:sz w:val="16"/>
+          <w:sz w:val="15"/>
         </w:rPr>
         <w:t>| --- | --- | --- | --- |</w:t>
       </w:r>
@@ -764,9 +1065,18 @@
       <w:r>
         <w:rPr>
           <w:rFonts w:ascii="Courier New" w:hAnsi="Courier New"/>
-          <w:sz w:val="16"/>
+          <w:sz w:val="15"/>
         </w:rPr>
         <w:t>| 2026-06-25 | 0.1 | JP-BR Insurance Knowledge Base | Criação inicial. |</w:t>
+      </w:r>
+    </w:p>
+    <w:p>
+      <w:r>
+        <w:rPr>
+          <w:rFonts w:ascii="Courier New" w:hAnsi="Courier New"/>
+          <w:sz w:val="15"/>
+        </w:rPr>
+        <w:t>| 2026-06-25 | 0.2 | JP-BR Insurance Knowledge Base | Inclusão do segundo lote AUTO. |</w:t>
       </w:r>
     </w:p>
     <w:sectPr>

</xml_diff>

<commit_message>
Add third automobile dialogues and cases
</commit_message>
<xml_diff>
--- a/18_DOCX/AUTO_INDEX_0001.docx
+++ b/18_DOCX/AUTO_INDEX_0001.docx
@@ -73,7 +73,7 @@
     </w:p>
     <w:p>
       <w:r>
-        <w:t>Este documento conecta o primeiro lote de verbetes, FAQs, diálogos e estudos de caso sobre seguro de automóvel no Japão. Deve ser usado como ponto de entrada para consulta rápida, treinamento editorial e recuperação de informações no NotebookLM.</w:t>
+        <w:t>Este documento conecta os lotes iniciais de verbetes, FAQs, diálogos e estudos de caso sobre seguro de automóvel no Japão. Deve ser usado como ponto de entrada para consulta rápida, treinamento editorial e recuperação de informações no NotebookLM.</w:t>
       </w:r>
     </w:p>
     <w:p>
@@ -169,6 +169,86 @@
         <w:pStyle w:val="ListBullet"/>
       </w:pPr>
       <w:r>
+        <w:t>保険期間</w:t>
+      </w:r>
+    </w:p>
+    <w:p>
+      <w:pPr>
+        <w:pStyle w:val="ListBullet"/>
+      </w:pPr>
+      <w:r>
+        <w:t>始期日</w:t>
+      </w:r>
+    </w:p>
+    <w:p>
+      <w:pPr>
+        <w:pStyle w:val="ListBullet"/>
+      </w:pPr>
+      <w:r>
+        <w:t>満期日</w:t>
+      </w:r>
+    </w:p>
+    <w:p>
+      <w:pPr>
+        <w:pStyle w:val="ListBullet"/>
+      </w:pPr>
+      <w:r>
+        <w:t>更新</w:t>
+      </w:r>
+    </w:p>
+    <w:p>
+      <w:pPr>
+        <w:pStyle w:val="ListBullet"/>
+      </w:pPr>
+      <w:r>
+        <w:t>解約</w:t>
+      </w:r>
+    </w:p>
+    <w:p>
+      <w:pPr>
+        <w:pStyle w:val="ListBullet"/>
+      </w:pPr>
+      <w:r>
+        <w:t>解約返戻金</w:t>
+      </w:r>
+    </w:p>
+    <w:p>
+      <w:pPr>
+        <w:pStyle w:val="ListBullet"/>
+      </w:pPr>
+      <w:r>
+        <w:t>契約者</w:t>
+      </w:r>
+    </w:p>
+    <w:p>
+      <w:pPr>
+        <w:pStyle w:val="ListBullet"/>
+      </w:pPr>
+      <w:r>
+        <w:t>被保険者</w:t>
+      </w:r>
+    </w:p>
+    <w:p>
+      <w:pPr>
+        <w:pStyle w:val="ListBullet"/>
+      </w:pPr>
+      <w:r>
+        <w:t>車両所有者</w:t>
+      </w:r>
+    </w:p>
+    <w:p>
+      <w:pPr>
+        <w:pStyle w:val="ListBullet"/>
+      </w:pPr>
+      <w:r>
+        <w:t>車検証</w:t>
+      </w:r>
+    </w:p>
+    <w:p>
+      <w:pPr>
+        <w:pStyle w:val="ListBullet"/>
+      </w:pPr>
+      <w:r>
         <w:t>seguro de automóvel</w:t>
       </w:r>
     </w:p>
@@ -198,6 +278,46 @@
     </w:p>
     <w:p>
       <w:pPr>
+        <w:pStyle w:val="ListBullet"/>
+      </w:pPr>
+      <w:r>
+        <w:t>renovação</w:t>
+      </w:r>
+    </w:p>
+    <w:p>
+      <w:pPr>
+        <w:pStyle w:val="ListBullet"/>
+      </w:pPr>
+      <w:r>
+        <w:t>cancelamento</w:t>
+      </w:r>
+    </w:p>
+    <w:p>
+      <w:pPr>
+        <w:pStyle w:val="ListBullet"/>
+      </w:pPr>
+      <w:r>
+        <w:t>contratante</w:t>
+      </w:r>
+    </w:p>
+    <w:p>
+      <w:pPr>
+        <w:pStyle w:val="ListBullet"/>
+      </w:pPr>
+      <w:r>
+        <w:t>segurado</w:t>
+      </w:r>
+    </w:p>
+    <w:p>
+      <w:pPr>
+        <w:pStyle w:val="ListBullet"/>
+      </w:pPr>
+      <w:r>
+        <w:t>proprietário do veículo</w:t>
+      </w:r>
+    </w:p>
+    <w:p>
+      <w:pPr>
         <w:pStyle w:val="Heading2"/>
       </w:pPr>
       <w:r>
@@ -422,6 +542,86 @@
     </w:p>
     <w:p>
       <w:pPr>
+        <w:pStyle w:val="ListBullet"/>
+      </w:pPr>
+      <w:r>
+        <w:t>AUTO-0021 - 保険期間 - Período do seguro</w:t>
+      </w:r>
+    </w:p>
+    <w:p>
+      <w:pPr>
+        <w:pStyle w:val="ListBullet"/>
+      </w:pPr>
+      <w:r>
+        <w:t>AUTO-0022 - 始期日 - Data de início da cobertura</w:t>
+      </w:r>
+    </w:p>
+    <w:p>
+      <w:pPr>
+        <w:pStyle w:val="ListBullet"/>
+      </w:pPr>
+      <w:r>
+        <w:t>AUTO-0023 - 満期日 - Data de vencimento do seguro</w:t>
+      </w:r>
+    </w:p>
+    <w:p>
+      <w:pPr>
+        <w:pStyle w:val="ListBullet"/>
+      </w:pPr>
+      <w:r>
+        <w:t>AUTO-0024 - 更新 - Renovação</w:t>
+      </w:r>
+    </w:p>
+    <w:p>
+      <w:pPr>
+        <w:pStyle w:val="ListBullet"/>
+      </w:pPr>
+      <w:r>
+        <w:t>AUTO-0025 - 解約 - Cancelamento do contrato</w:t>
+      </w:r>
+    </w:p>
+    <w:p>
+      <w:pPr>
+        <w:pStyle w:val="ListBullet"/>
+      </w:pPr>
+      <w:r>
+        <w:t>AUTO-0026 - 解約返戻金 - Valor de devolução por cancelamento</w:t>
+      </w:r>
+    </w:p>
+    <w:p>
+      <w:pPr>
+        <w:pStyle w:val="ListBullet"/>
+      </w:pPr>
+      <w:r>
+        <w:t>AUTO-0027 - 契約者 - Contratante</w:t>
+      </w:r>
+    </w:p>
+    <w:p>
+      <w:pPr>
+        <w:pStyle w:val="ListBullet"/>
+      </w:pPr>
+      <w:r>
+        <w:t>AUTO-0028 - 被保険者 - Segurado</w:t>
+      </w:r>
+    </w:p>
+    <w:p>
+      <w:pPr>
+        <w:pStyle w:val="ListBullet"/>
+      </w:pPr>
+      <w:r>
+        <w:t>AUTO-0029 - 車両所有者 - Proprietário do veículo</w:t>
+      </w:r>
+    </w:p>
+    <w:p>
+      <w:pPr>
+        <w:pStyle w:val="ListBullet"/>
+      </w:pPr>
+      <w:r>
+        <w:t>AUTO-0030 - 車検証 - Certificado de inspeção veicular</w:t>
+      </w:r>
+    </w:p>
+    <w:p>
+      <w:pPr>
         <w:pStyle w:val="Heading3"/>
       </w:pPr>
       <w:r>
@@ -590,6 +790,62 @@
     </w:p>
     <w:p>
       <w:pPr>
+        <w:pStyle w:val="ListBullet"/>
+      </w:pPr>
+      <w:r>
+        <w:t>FAQ-AUTO-0021 - A partir de quando o seguro começa a valer?</w:t>
+      </w:r>
+    </w:p>
+    <w:p>
+      <w:pPr>
+        <w:pStyle w:val="ListBullet"/>
+      </w:pPr>
+      <w:r>
+        <w:t>FAQ-AUTO-0022 - O que acontece se o seguro vencer?</w:t>
+      </w:r>
+    </w:p>
+    <w:p>
+      <w:pPr>
+        <w:pStyle w:val="ListBullet"/>
+      </w:pPr>
+      <w:r>
+        <w:t>FAQ-AUTO-0023 - O que devo revisar na renovação?</w:t>
+      </w:r>
+    </w:p>
+    <w:p>
+      <w:pPr>
+        <w:pStyle w:val="ListBullet"/>
+      </w:pPr>
+      <w:r>
+        <w:t>FAQ-AUTO-0024 - Posso cancelar o seguro antes do vencimento?</w:t>
+      </w:r>
+    </w:p>
+    <w:p>
+      <w:pPr>
+        <w:pStyle w:val="ListBullet"/>
+      </w:pPr>
+      <w:r>
+        <w:t>FAQ-AUTO-0025 - Recebo dinheiro de volta se cancelar?</w:t>
+      </w:r>
+    </w:p>
+    <w:p>
+      <w:pPr>
+        <w:pStyle w:val="ListBullet"/>
+      </w:pPr>
+      <w:r>
+        <w:t>FAQ-AUTO-0026 - Contratante, segurado e dono do carro são sempre a mesma pessoa?</w:t>
+      </w:r>
+    </w:p>
+    <w:p>
+      <w:pPr>
+        <w:pStyle w:val="ListBullet"/>
+      </w:pPr>
+      <w:r>
+        <w:t>FAQ-AUTO-0027 - Por que preciso enviar o 車検証?</w:t>
+      </w:r>
+    </w:p>
+    <w:p>
+      <w:pPr>
         <w:pStyle w:val="Heading3"/>
       </w:pPr>
       <w:r>
@@ -662,6 +918,30 @@
     </w:p>
     <w:p>
       <w:pPr>
+        <w:pStyle w:val="ListBullet"/>
+      </w:pPr>
+      <w:r>
+        <w:t>DIALOGUE-AUTO-0009 - Explicando vigência e renovação do seguro</w:t>
+      </w:r>
+    </w:p>
+    <w:p>
+      <w:pPr>
+        <w:pStyle w:val="ListBullet"/>
+      </w:pPr>
+      <w:r>
+        <w:t>DIALOGUE-AUTO-0010 - Explicando cancelamento e devolução de prêmio</w:t>
+      </w:r>
+    </w:p>
+    <w:p>
+      <w:pPr>
+        <w:pStyle w:val="ListBullet"/>
+      </w:pPr>
+      <w:r>
+        <w:t>DIALOGUE-AUTO-0011 - Conferindo contratante, segurado, proprietário e 車検証</w:t>
+      </w:r>
+    </w:p>
+    <w:p>
+      <w:pPr>
         <w:pStyle w:val="Heading3"/>
       </w:pPr>
       <w:r>
@@ -762,6 +1042,38 @@
       </w:pPr>
       <w:r>
         <w:t>CASE-AUTO-0012 - Cliente precisa de 交通事故証明書 após colisão</w:t>
+      </w:r>
+    </w:p>
+    <w:p>
+      <w:pPr>
+        <w:pStyle w:val="ListBullet"/>
+      </w:pPr>
+      <w:r>
+        <w:t>CASE-AUTO-0013 - Cliente fica sem cobertura por atraso na renovação</w:t>
+      </w:r>
+    </w:p>
+    <w:p>
+      <w:pPr>
+        <w:pStyle w:val="ListBullet"/>
+      </w:pPr>
+      <w:r>
+        <w:t>CASE-AUTO-0014 - Renovação usada para corrigir informações do contrato</w:t>
+      </w:r>
+    </w:p>
+    <w:p>
+      <w:pPr>
+        <w:pStyle w:val="ListBullet"/>
+      </w:pPr>
+      <w:r>
+        <w:t>CASE-AUTO-0015 - Cliente espera devolução total após cancelamento</w:t>
+      </w:r>
+    </w:p>
+    <w:p>
+      <w:pPr>
+        <w:pStyle w:val="ListBullet"/>
+      </w:pPr>
+      <w:r>
+        <w:t>CASE-AUTO-0016 - Divergência entre contratante, segurado e proprietário do veículo</w:t>
       </w:r>
     </w:p>
     <w:p>
@@ -774,137 +1086,92 @@
     </w:p>
     <w:p>
       <w:r>
-        <w:rPr>
-          <w:rFonts w:ascii="Courier New" w:hAnsi="Courier New"/>
-          <w:sz w:val="15"/>
-        </w:rPr>
         <w:t>| Tema | Verbetes | FAQs | Diálogos | Casos |</w:t>
       </w:r>
     </w:p>
     <w:p>
       <w:r>
-        <w:rPr>
-          <w:rFonts w:ascii="Courier New" w:hAnsi="Courier New"/>
-          <w:sz w:val="15"/>
-        </w:rPr>
         <w:t>| --- | --- | --- | --- | --- |</w:t>
       </w:r>
     </w:p>
     <w:p>
       <w:r>
-        <w:rPr>
-          <w:rFonts w:ascii="Courier New" w:hAnsi="Courier New"/>
-          <w:sz w:val="15"/>
-        </w:rPr>
         <w:t>| Cobertura geral | AUTO-0001 | FAQ-AUTO-0001 | DIALOGUE-AUTO-0001 | CASE-AUTO-0001 |</w:t>
       </w:r>
     </w:p>
     <w:p>
       <w:r>
-        <w:rPr>
-          <w:rFonts w:ascii="Courier New" w:hAnsi="Courier New"/>
-          <w:sz w:val="15"/>
-        </w:rPr>
         <w:t>| Danos pessoais a terceiros | AUTO-0002 | FAQ-AUTO-0002 | DIALOGUE-AUTO-0001 | CASE-AUTO-0002 |</w:t>
       </w:r>
     </w:p>
     <w:p>
       <w:r>
-        <w:rPr>
-          <w:rFonts w:ascii="Courier New" w:hAnsi="Courier New"/>
-          <w:sz w:val="15"/>
-        </w:rPr>
         <w:t>| Danos materiais a terceiros | AUTO-0003 | FAQ-AUTO-0003 | DIALOGUE-AUTO-0001 | CASE-AUTO-0003 |</w:t>
       </w:r>
     </w:p>
     <w:p>
       <w:r>
-        <w:rPr>
-          <w:rFonts w:ascii="Courier New" w:hAnsi="Courier New"/>
-          <w:sz w:val="15"/>
-        </w:rPr>
         <w:t>| Próprio veículo | AUTO-0004 | FAQ-AUTO-0004 | DIALOGUE-AUTO-0002 | CASE-AUTO-0004 |</w:t>
       </w:r>
     </w:p>
     <w:p>
       <w:r>
-        <w:rPr>
-          <w:rFonts w:ascii="Courier New" w:hAnsi="Courier New"/>
-          <w:sz w:val="15"/>
-        </w:rPr>
         <w:t>| Pessoas no veículo | AUTO-0005, AUTO-0006 | FAQ-AUTO-0005, FAQ-AUTO-0006 | DIALOGUE-AUTO-0002 | CASE-AUTO-0005 |</w:t>
       </w:r>
     </w:p>
     <w:p>
       <w:r>
-        <w:rPr>
-          <w:rFonts w:ascii="Courier New" w:hAnsi="Courier New"/>
-          <w:sz w:val="15"/>
-        </w:rPr>
         <w:t>| Franquia | AUTO-0007 | FAQ-AUTO-0007 | DIALOGUE-AUTO-0003 | CASE-AUTO-0006 |</w:t>
       </w:r>
     </w:p>
     <w:p>
       <w:r>
-        <w:rPr>
-          <w:rFonts w:ascii="Courier New" w:hAnsi="Courier New"/>
-          <w:sz w:val="15"/>
-        </w:rPr>
         <w:t>| Classe e preço | AUTO-0008, AUTO-0009 | FAQ-AUTO-0008, FAQ-AUTO-0009 | DIALOGUE-AUTO-0003 | CASE-AUTO-0007 |</w:t>
       </w:r>
     </w:p>
     <w:p>
       <w:r>
-        <w:rPr>
-          <w:rFonts w:ascii="Courier New" w:hAnsi="Courier New"/>
-          <w:sz w:val="15"/>
-        </w:rPr>
         <w:t>| Indenização | AUTO-0010 | FAQ-AUTO-0010 | DIALOGUE-AUTO-0004 | CASE-AUTO-0008 |</w:t>
       </w:r>
     </w:p>
     <w:p>
       <w:r>
-        <w:rPr>
-          <w:rFonts w:ascii="Courier New" w:hAnsi="Courier New"/>
-          <w:sz w:val="15"/>
-        </w:rPr>
         <w:t>| Seguro obrigatório e voluntário | AUTO-0011, AUTO-0012 | FAQ-AUTO-0011, FAQ-AUTO-0012 | DIALOGUE-AUTO-0005 | CASE-AUTO-0009 |</w:t>
       </w:r>
     </w:p>
     <w:p>
       <w:r>
-        <w:rPr>
-          <w:rFonts w:ascii="Courier New" w:hAnsi="Courier New"/>
-          <w:sz w:val="15"/>
-        </w:rPr>
         <w:t>| Assistência e carro substituto | AUTO-0013, AUTO-0015 | FAQ-AUTO-0013, FAQ-AUTO-0015 | DIALOGUE-AUTO-0006 | CASE-AUTO-0010 |</w:t>
       </w:r>
     </w:p>
     <w:p>
       <w:r>
-        <w:rPr>
-          <w:rFonts w:ascii="Courier New" w:hAnsi="Courier New"/>
-          <w:sz w:val="15"/>
-        </w:rPr>
         <w:t>| Cobertura de advogado | AUTO-0014 | FAQ-AUTO-0014 | DIALOGUE-AUTO-0008 | CASE-AUTO-0012 |</w:t>
       </w:r>
     </w:p>
     <w:p>
       <w:r>
-        <w:rPr>
-          <w:rFonts w:ascii="Courier New" w:hAnsi="Courier New"/>
-          <w:sz w:val="15"/>
-        </w:rPr>
         <w:t>| Condutores, idade e uso | AUTO-0016, AUTO-0017, AUTO-0018 | FAQ-AUTO-0016, FAQ-AUTO-0017, FAQ-AUTO-0018 | DIALOGUE-AUTO-0007 | CASE-AUTO-0011 |</w:t>
       </w:r>
     </w:p>
     <w:p>
       <w:r>
-        <w:rPr>
-          <w:rFonts w:ascii="Courier New" w:hAnsi="Courier New"/>
-          <w:sz w:val="15"/>
-        </w:rPr>
         <w:t>| Aviso e certificado de acidente | AUTO-0019, AUTO-0020 | FAQ-AUTO-0019, FAQ-AUTO-0020 | DIALOGUE-AUTO-0008 | CASE-AUTO-0012 |</w:t>
+      </w:r>
+    </w:p>
+    <w:p>
+      <w:r>
+        <w:t>| Vigência e renovação | AUTO-0021, AUTO-0022, AUTO-0023, AUTO-0024 | FAQ-AUTO-0021, FAQ-AUTO-0022, FAQ-AUTO-0023 | DIALOGUE-AUTO-0009 | CASE-AUTO-0013, CASE-AUTO-0014 |</w:t>
+      </w:r>
+    </w:p>
+    <w:p>
+      <w:r>
+        <w:t>| Cancelamento e devolução | AUTO-0025, AUTO-0026 | FAQ-AUTO-0024, FAQ-AUTO-0025 | DIALOGUE-AUTO-0010 | CASE-AUTO-0015 |</w:t>
+      </w:r>
+    </w:p>
+    <w:p>
+      <w:r>
+        <w:t>| Papéis contratuais e documento do veículo | AUTO-0027, AUTO-0028, AUTO-0029, AUTO-0030 | FAQ-AUTO-0026, FAQ-AUTO-0027 | DIALOGUE-AUTO-0011 | CASE-AUTO-0016 |</w:t>
       </w:r>
     </w:p>
     <w:p>
@@ -1033,6 +1300,38 @@
       </w:pPr>
       <w:r>
         <w:t>`19_Markdown/AUTO/AUTO_CASES_0009_0012.md`</w:t>
+      </w:r>
+    </w:p>
+    <w:p>
+      <w:pPr>
+        <w:pStyle w:val="ListBullet"/>
+      </w:pPr>
+      <w:r>
+        <w:t>`19_Markdown/AUTO/AUTO_TERMS_0021_0030.md`</w:t>
+      </w:r>
+    </w:p>
+    <w:p>
+      <w:pPr>
+        <w:pStyle w:val="ListBullet"/>
+      </w:pPr>
+      <w:r>
+        <w:t>`19_Markdown/AUTO/AUTO_FAQ_0021_0027.md`</w:t>
+      </w:r>
+    </w:p>
+    <w:p>
+      <w:pPr>
+        <w:pStyle w:val="ListBullet"/>
+      </w:pPr>
+      <w:r>
+        <w:t>`19_Markdown/AUTO/AUTO_DIALOGUES_0009_0011.md`</w:t>
+      </w:r>
+    </w:p>
+    <w:p>
+      <w:pPr>
+        <w:pStyle w:val="ListBullet"/>
+      </w:pPr>
+      <w:r>
+        <w:t>`19_Markdown/AUTO/AUTO_CASES_0013_0016.md`</w:t>
       </w:r>
     </w:p>
     <w:p>
@@ -1045,43 +1344,32 @@
     </w:p>
     <w:p>
       <w:r>
-        <w:rPr>
-          <w:rFonts w:ascii="Courier New" w:hAnsi="Courier New"/>
-          <w:sz w:val="15"/>
-        </w:rPr>
         <w:t>| Data | Versão | Autor | Alteração |</w:t>
       </w:r>
     </w:p>
     <w:p>
       <w:r>
-        <w:rPr>
-          <w:rFonts w:ascii="Courier New" w:hAnsi="Courier New"/>
-          <w:sz w:val="15"/>
-        </w:rPr>
         <w:t>| --- | --- | --- | --- |</w:t>
       </w:r>
     </w:p>
     <w:p>
       <w:r>
-        <w:rPr>
-          <w:rFonts w:ascii="Courier New" w:hAnsi="Courier New"/>
-          <w:sz w:val="15"/>
-        </w:rPr>
         <w:t>| 2026-06-25 | 0.1 | JP-BR Insurance Knowledge Base | Criação inicial. |</w:t>
       </w:r>
     </w:p>
     <w:p>
       <w:r>
-        <w:rPr>
-          <w:rFonts w:ascii="Courier New" w:hAnsi="Courier New"/>
-          <w:sz w:val="15"/>
-        </w:rPr>
         <w:t>| 2026-06-25 | 0.2 | JP-BR Insurance Knowledge Base | Inclusão do segundo lote AUTO. |</w:t>
+      </w:r>
+    </w:p>
+    <w:p>
+      <w:r>
+        <w:t>| 2026-06-25 | 0.3 | JP-BR Insurance Knowledge Base | Inclusão do terceiro lote AUTO. |</w:t>
       </w:r>
     </w:p>
     <w:sectPr>
       <w:pgSz w:w="12240" w:h="15840"/>
-      <w:pgMar w:top="1080" w:right="1224" w:bottom="1080" w:left="1224" w:header="720" w:footer="720" w:gutter="0"/>
+      <w:pgMar w:top="1440" w:right="1800" w:bottom="1440" w:left="1800" w:header="720" w:footer="720" w:gutter="0"/>
       <w:cols w:space="720"/>
       <w:docGrid w:linePitch="360"/>
     </w:sectPr>
@@ -1453,7 +1741,7 @@
     <w:qFormat/>
     <w:rsid w:val="00FC693F"/>
     <w:rPr>
-      <w:rFonts w:ascii="Arial" w:hAnsi="Arial"/>
+      <w:rFonts w:ascii="Arial Unicode MS" w:hAnsi="Arial Unicode MS"/>
       <w:sz w:val="20"/>
     </w:rPr>
   </w:style>

</xml_diff>

<commit_message>
Add fourth automobile dialogues and cases
</commit_message>
<xml_diff>
--- a/18_DOCX/AUTO_INDEX_0001.docx
+++ b/18_DOCX/AUTO_INDEX_0001.docx
@@ -249,6 +249,86 @@
         <w:pStyle w:val="ListBullet"/>
       </w:pPr>
       <w:r>
+        <w:t>払込方法</w:t>
+      </w:r>
+    </w:p>
+    <w:p>
+      <w:pPr>
+        <w:pStyle w:val="ListBullet"/>
+      </w:pPr>
+      <w:r>
+        <w:t>月払</w:t>
+      </w:r>
+    </w:p>
+    <w:p>
+      <w:pPr>
+        <w:pStyle w:val="ListBullet"/>
+      </w:pPr>
+      <w:r>
+        <w:t>年払</w:t>
+      </w:r>
+    </w:p>
+    <w:p>
+      <w:pPr>
+        <w:pStyle w:val="ListBullet"/>
+      </w:pPr>
+      <w:r>
+        <w:t>口座振替</w:t>
+      </w:r>
+    </w:p>
+    <w:p>
+      <w:pPr>
+        <w:pStyle w:val="ListBullet"/>
+      </w:pPr>
+      <w:r>
+        <w:t>クレジットカード払</w:t>
+      </w:r>
+    </w:p>
+    <w:p>
+      <w:pPr>
+        <w:pStyle w:val="ListBullet"/>
+      </w:pPr>
+      <w:r>
+        <w:t>払込期日</w:t>
+      </w:r>
+    </w:p>
+    <w:p>
+      <w:pPr>
+        <w:pStyle w:val="ListBullet"/>
+      </w:pPr>
+      <w:r>
+        <w:t>払込猶予期間</w:t>
+      </w:r>
+    </w:p>
+    <w:p>
+      <w:pPr>
+        <w:pStyle w:val="ListBullet"/>
+      </w:pPr>
+      <w:r>
+        <w:t>失効</w:t>
+      </w:r>
+    </w:p>
+    <w:p>
+      <w:pPr>
+        <w:pStyle w:val="ListBullet"/>
+      </w:pPr>
+      <w:r>
+        <w:t>契約内容変更</w:t>
+      </w:r>
+    </w:p>
+    <w:p>
+      <w:pPr>
+        <w:pStyle w:val="ListBullet"/>
+      </w:pPr>
+      <w:r>
+        <w:t>車両入替</w:t>
+      </w:r>
+    </w:p>
+    <w:p>
+      <w:pPr>
+        <w:pStyle w:val="ListBullet"/>
+      </w:pPr>
+      <w:r>
         <w:t>seguro de automóvel</w:t>
       </w:r>
     </w:p>
@@ -318,6 +398,54 @@
     </w:p>
     <w:p>
       <w:pPr>
+        <w:pStyle w:val="ListBullet"/>
+      </w:pPr>
+      <w:r>
+        <w:t>pagamento mensal</w:t>
+      </w:r>
+    </w:p>
+    <w:p>
+      <w:pPr>
+        <w:pStyle w:val="ListBullet"/>
+      </w:pPr>
+      <w:r>
+        <w:t>pagamento anual</w:t>
+      </w:r>
+    </w:p>
+    <w:p>
+      <w:pPr>
+        <w:pStyle w:val="ListBullet"/>
+      </w:pPr>
+      <w:r>
+        <w:t>débito em conta</w:t>
+      </w:r>
+    </w:p>
+    <w:p>
+      <w:pPr>
+        <w:pStyle w:val="ListBullet"/>
+      </w:pPr>
+      <w:r>
+        <w:t>cartão de crédito</w:t>
+      </w:r>
+    </w:p>
+    <w:p>
+      <w:pPr>
+        <w:pStyle w:val="ListBullet"/>
+      </w:pPr>
+      <w:r>
+        <w:t>alteração de contrato</w:t>
+      </w:r>
+    </w:p>
+    <w:p>
+      <w:pPr>
+        <w:pStyle w:val="ListBullet"/>
+      </w:pPr>
+      <w:r>
+        <w:t>substituição do veículo</w:t>
+      </w:r>
+    </w:p>
+    <w:p>
+      <w:pPr>
         <w:pStyle w:val="Heading2"/>
       </w:pPr>
       <w:r>
@@ -622,6 +750,86 @@
     </w:p>
     <w:p>
       <w:pPr>
+        <w:pStyle w:val="ListBullet"/>
+      </w:pPr>
+      <w:r>
+        <w:t>AUTO-0031 - 払込方法 - Forma de pagamento</w:t>
+      </w:r>
+    </w:p>
+    <w:p>
+      <w:pPr>
+        <w:pStyle w:val="ListBullet"/>
+      </w:pPr>
+      <w:r>
+        <w:t>AUTO-0032 - 月払 - Pagamento mensal</w:t>
+      </w:r>
+    </w:p>
+    <w:p>
+      <w:pPr>
+        <w:pStyle w:val="ListBullet"/>
+      </w:pPr>
+      <w:r>
+        <w:t>AUTO-0033 - 年払 - Pagamento anual</w:t>
+      </w:r>
+    </w:p>
+    <w:p>
+      <w:pPr>
+        <w:pStyle w:val="ListBullet"/>
+      </w:pPr>
+      <w:r>
+        <w:t>AUTO-0034 - 口座振替 - Débito em conta</w:t>
+      </w:r>
+    </w:p>
+    <w:p>
+      <w:pPr>
+        <w:pStyle w:val="ListBullet"/>
+      </w:pPr>
+      <w:r>
+        <w:t>AUTO-0035 - クレジットカード払 - Pagamento por cartão de crédito</w:t>
+      </w:r>
+    </w:p>
+    <w:p>
+      <w:pPr>
+        <w:pStyle w:val="ListBullet"/>
+      </w:pPr>
+      <w:r>
+        <w:t>AUTO-0036 - 払込期日 - Data limite de pagamento</w:t>
+      </w:r>
+    </w:p>
+    <w:p>
+      <w:pPr>
+        <w:pStyle w:val="ListBullet"/>
+      </w:pPr>
+      <w:r>
+        <w:t>AUTO-0037 - 払込猶予期間 - Período de tolerância para pagamento</w:t>
+      </w:r>
+    </w:p>
+    <w:p>
+      <w:pPr>
+        <w:pStyle w:val="ListBullet"/>
+      </w:pPr>
+      <w:r>
+        <w:t>AUTO-0038 - 失効 - Perda de validade do contrato</w:t>
+      </w:r>
+    </w:p>
+    <w:p>
+      <w:pPr>
+        <w:pStyle w:val="ListBullet"/>
+      </w:pPr>
+      <w:r>
+        <w:t>AUTO-0039 - 契約内容変更 - Alteração de dados do contrato</w:t>
+      </w:r>
+    </w:p>
+    <w:p>
+      <w:pPr>
+        <w:pStyle w:val="ListBullet"/>
+      </w:pPr>
+      <w:r>
+        <w:t>AUTO-0040 - 車両入替 - Substituição do veículo segurado</w:t>
+      </w:r>
+    </w:p>
+    <w:p>
+      <w:pPr>
         <w:pStyle w:val="Heading3"/>
       </w:pPr>
       <w:r>
@@ -846,6 +1054,86 @@
     </w:p>
     <w:p>
       <w:pPr>
+        <w:pStyle w:val="ListBullet"/>
+      </w:pPr>
+      <w:r>
+        <w:t>FAQ-AUTO-0028 - Quais formas de pagamento posso usar no seguro?</w:t>
+      </w:r>
+    </w:p>
+    <w:p>
+      <w:pPr>
+        <w:pStyle w:val="ListBullet"/>
+      </w:pPr>
+      <w:r>
+        <w:t>FAQ-AUTO-0029 - Posso pagar o seguro por mês?</w:t>
+      </w:r>
+    </w:p>
+    <w:p>
+      <w:pPr>
+        <w:pStyle w:val="ListBullet"/>
+      </w:pPr>
+      <w:r>
+        <w:t>FAQ-AUTO-0030 - Qual é a diferença entre pagar mensal e anual?</w:t>
+      </w:r>
+    </w:p>
+    <w:p>
+      <w:pPr>
+        <w:pStyle w:val="ListBullet"/>
+      </w:pPr>
+      <w:r>
+        <w:t>FAQ-AUTO-0031 - O que acontece se o débito em conta falhar?</w:t>
+      </w:r>
+    </w:p>
+    <w:p>
+      <w:pPr>
+        <w:pStyle w:val="ListBullet"/>
+      </w:pPr>
+      <w:r>
+        <w:t>FAQ-AUTO-0032 - Posso pagar com cartão de crédito?</w:t>
+      </w:r>
+    </w:p>
+    <w:p>
+      <w:pPr>
+        <w:pStyle w:val="ListBullet"/>
+      </w:pPr>
+      <w:r>
+        <w:t>FAQ-AUTO-0033 - O que acontece se eu atrasar o pagamento?</w:t>
+      </w:r>
+    </w:p>
+    <w:p>
+      <w:pPr>
+        <w:pStyle w:val="ListBullet"/>
+      </w:pPr>
+      <w:r>
+        <w:t>FAQ-AUTO-0034 - Existe prazo extra se eu não conseguir pagar no dia?</w:t>
+      </w:r>
+    </w:p>
+    <w:p>
+      <w:pPr>
+        <w:pStyle w:val="ListBullet"/>
+      </w:pPr>
+      <w:r>
+        <w:t>FAQ-AUTO-0035 - Posso ficar sem seguro por falta de pagamento?</w:t>
+      </w:r>
+    </w:p>
+    <w:p>
+      <w:pPr>
+        <w:pStyle w:val="ListBullet"/>
+      </w:pPr>
+      <w:r>
+        <w:t>FAQ-AUTO-0036 - Quando preciso avisar mudança no contrato?</w:t>
+      </w:r>
+    </w:p>
+    <w:p>
+      <w:pPr>
+        <w:pStyle w:val="ListBullet"/>
+      </w:pPr>
+      <w:r>
+        <w:t>FAQ-AUTO-0037 - Troquei de carro. Preciso mudar o seguro?</w:t>
+      </w:r>
+    </w:p>
+    <w:p>
+      <w:pPr>
         <w:pStyle w:val="Heading3"/>
       </w:pPr>
       <w:r>
@@ -942,6 +1230,30 @@
     </w:p>
     <w:p>
       <w:pPr>
+        <w:pStyle w:val="ListBullet"/>
+      </w:pPr>
+      <w:r>
+        <w:t>DIALOGUE-AUTO-0012 - Explicando formas de pagamento mensal e anual</w:t>
+      </w:r>
+    </w:p>
+    <w:p>
+      <w:pPr>
+        <w:pStyle w:val="ListBullet"/>
+      </w:pPr>
+      <w:r>
+        <w:t>DIALOGUE-AUTO-0013 - Orientando falha de cobrança e atraso de pagamento</w:t>
+      </w:r>
+    </w:p>
+    <w:p>
+      <w:pPr>
+        <w:pStyle w:val="ListBullet"/>
+      </w:pPr>
+      <w:r>
+        <w:t>DIALOGUE-AUTO-0014 - Explicando perda de validade, alteração de contrato e troca de veículo</w:t>
+      </w:r>
+    </w:p>
+    <w:p>
+      <w:pPr>
         <w:pStyle w:val="Heading3"/>
       </w:pPr>
       <w:r>
@@ -1074,6 +1386,38 @@
       </w:pPr>
       <w:r>
         <w:t>CASE-AUTO-0016 - Divergência entre contratante, segurado e proprietário do veículo</w:t>
+      </w:r>
+    </w:p>
+    <w:p>
+      <w:pPr>
+        <w:pStyle w:val="ListBullet"/>
+      </w:pPr>
+      <w:r>
+        <w:t>CASE-AUTO-0017 - Cliente escolhe entre pagamento mensal e anual</w:t>
+      </w:r>
+    </w:p>
+    <w:p>
+      <w:pPr>
+        <w:pStyle w:val="ListBullet"/>
+      </w:pPr>
+      <w:r>
+        <w:t>CASE-AUTO-0018 - Falha no débito em conta ou cartão de crédito</w:t>
+      </w:r>
+    </w:p>
+    <w:p>
+      <w:pPr>
+        <w:pStyle w:val="ListBullet"/>
+      </w:pPr>
+      <w:r>
+        <w:t>CASE-AUTO-0019 - Contrato em risco por atraso de pagamento</w:t>
+      </w:r>
+    </w:p>
+    <w:p>
+      <w:pPr>
+        <w:pStyle w:val="ListBullet"/>
+      </w:pPr>
+      <w:r>
+        <w:t>CASE-AUTO-0020 - Cliente troca de carro sem atualizar o seguro</w:t>
       </w:r>
     </w:p>
     <w:p>
@@ -1175,6 +1519,21 @@
       </w:r>
     </w:p>
     <w:p>
+      <w:r>
+        <w:t>| Formas de pagamento | AUTO-0031, AUTO-0032, AUTO-0033, AUTO-0034, AUTO-0035 | FAQ-AUTO-0028, FAQ-AUTO-0029, FAQ-AUTO-0030, FAQ-AUTO-0031, FAQ-AUTO-0032 | DIALOGUE-AUTO-0012, DIALOGUE-AUTO-0013 | CASE-AUTO-0017, CASE-AUTO-0018 |</w:t>
+      </w:r>
+    </w:p>
+    <w:p>
+      <w:r>
+        <w:t>| Atraso e validade | AUTO-0036, AUTO-0037, AUTO-0038 | FAQ-AUTO-0033, FAQ-AUTO-0034, FAQ-AUTO-0035 | DIALOGUE-AUTO-0013, DIALOGUE-AUTO-0014 | CASE-AUTO-0019 |</w:t>
+      </w:r>
+    </w:p>
+    <w:p>
+      <w:r>
+        <w:t>| Alteração e troca de veículo | AUTO-0039, AUTO-0040 | FAQ-AUTO-0036, FAQ-AUTO-0037 | DIALOGUE-AUTO-0014 | CASE-AUTO-0020 |</w:t>
+      </w:r>
+    </w:p>
+    <w:p>
       <w:pPr>
         <w:pStyle w:val="Heading2"/>
       </w:pPr>
@@ -1332,6 +1691,38 @@
       </w:pPr>
       <w:r>
         <w:t>`19_Markdown/AUTO/AUTO_CASES_0013_0016.md`</w:t>
+      </w:r>
+    </w:p>
+    <w:p>
+      <w:pPr>
+        <w:pStyle w:val="ListBullet"/>
+      </w:pPr>
+      <w:r>
+        <w:t>`19_Markdown/AUTO/AUTO_TERMS_0031_0040.md`</w:t>
+      </w:r>
+    </w:p>
+    <w:p>
+      <w:pPr>
+        <w:pStyle w:val="ListBullet"/>
+      </w:pPr>
+      <w:r>
+        <w:t>`19_Markdown/AUTO/AUTO_FAQ_0028_0037.md`</w:t>
+      </w:r>
+    </w:p>
+    <w:p>
+      <w:pPr>
+        <w:pStyle w:val="ListBullet"/>
+      </w:pPr>
+      <w:r>
+        <w:t>`19_Markdown/AUTO/AUTO_DIALOGUES_0012_0014.md`</w:t>
+      </w:r>
+    </w:p>
+    <w:p>
+      <w:pPr>
+        <w:pStyle w:val="ListBullet"/>
+      </w:pPr>
+      <w:r>
+        <w:t>`19_Markdown/AUTO/AUTO_CASES_0017_0020.md`</w:t>
       </w:r>
     </w:p>
     <w:p>
@@ -1365,6 +1756,11 @@
     <w:p>
       <w:r>
         <w:t>| 2026-06-25 | 0.3 | JP-BR Insurance Knowledge Base | Inclusão do terceiro lote AUTO. |</w:t>
+      </w:r>
+    </w:p>
+    <w:p>
+      <w:r>
+        <w:t>| 2026-06-25 | 0.4 | JP-BR Insurance Knowledge Base | Inclusão do quarto lote AUTO. |</w:t>
       </w:r>
     </w:p>
     <w:sectPr>

</xml_diff>

<commit_message>
Add large automobile claims editorial cycle
</commit_message>
<xml_diff>
--- a/18_DOCX/AUTO_INDEX_0001.docx
+++ b/18_DOCX/AUTO_INDEX_0001.docx
@@ -830,6 +830,166 @@
     </w:p>
     <w:p>
       <w:pPr>
+        <w:pStyle w:val="ListBullet"/>
+      </w:pPr>
+      <w:r>
+        <w:t>AUTO-0041 - 事故状況 - Circunstâncias do acidente</w:t>
+      </w:r>
+    </w:p>
+    <w:p>
+      <w:pPr>
+        <w:pStyle w:val="ListBullet"/>
+      </w:pPr>
+      <w:r>
+        <w:t>AUTO-0042 - 相手方 - Outra parte envolvida</w:t>
+      </w:r>
+    </w:p>
+    <w:p>
+      <w:pPr>
+        <w:pStyle w:val="ListBullet"/>
+      </w:pPr>
+      <w:r>
+        <w:t>AUTO-0043 - 過失割合 - Percentual de culpa</w:t>
+      </w:r>
+    </w:p>
+    <w:p>
+      <w:pPr>
+        <w:pStyle w:val="ListBullet"/>
+      </w:pPr>
+      <w:r>
+        <w:t>AUTO-0044 - 示談 - Acordo extrajudicial</w:t>
+      </w:r>
+    </w:p>
+    <w:p>
+      <w:pPr>
+        <w:pStyle w:val="ListBullet"/>
+      </w:pPr>
+      <w:r>
+        <w:t>AUTO-0045 - 損害賠償 - Indenização por danos</w:t>
+      </w:r>
+    </w:p>
+    <w:p>
+      <w:pPr>
+        <w:pStyle w:val="ListBullet"/>
+      </w:pPr>
+      <w:r>
+        <w:t>AUTO-0046 - 修理見積書 - Orçamento de reparo</w:t>
+      </w:r>
+    </w:p>
+    <w:p>
+      <w:pPr>
+        <w:pStyle w:val="ListBullet"/>
+      </w:pPr>
+      <w:r>
+        <w:t>AUTO-0047 - 損害調査 - Avaliação de danos</w:t>
+      </w:r>
+    </w:p>
+    <w:p>
+      <w:pPr>
+        <w:pStyle w:val="ListBullet"/>
+      </w:pPr>
+      <w:r>
+        <w:t>AUTO-0048 - 全損 - Perda total</w:t>
+      </w:r>
+    </w:p>
+    <w:p>
+      <w:pPr>
+        <w:pStyle w:val="ListBullet"/>
+      </w:pPr>
+      <w:r>
+        <w:t>AUTO-0049 - 分損 - Perda parcial</w:t>
+      </w:r>
+    </w:p>
+    <w:p>
+      <w:pPr>
+        <w:pStyle w:val="ListBullet"/>
+      </w:pPr>
+      <w:r>
+        <w:t>AUTO-0050 - レッカー搬送 - Remoção por guincho</w:t>
+      </w:r>
+    </w:p>
+    <w:p>
+      <w:pPr>
+        <w:pStyle w:val="ListBullet"/>
+      </w:pPr>
+      <w:r>
+        <w:t>AUTO-0051 - 修理工場 - Oficina de reparo</w:t>
+      </w:r>
+    </w:p>
+    <w:p>
+      <w:pPr>
+        <w:pStyle w:val="ListBullet"/>
+      </w:pPr>
+      <w:r>
+        <w:t>AUTO-0052 - 保険会社 - Seguradora</w:t>
+      </w:r>
+    </w:p>
+    <w:p>
+      <w:pPr>
+        <w:pStyle w:val="ListBullet"/>
+      </w:pPr>
+      <w:r>
+        <w:t>AUTO-0053 - 保険代理店 - Agência ou corretora de seguros</w:t>
+      </w:r>
+    </w:p>
+    <w:p>
+      <w:pPr>
+        <w:pStyle w:val="ListBullet"/>
+      </w:pPr>
+      <w:r>
+        <w:t>AUTO-0054 - 契約申込書 - Proposta de contratação</w:t>
+      </w:r>
+    </w:p>
+    <w:p>
+      <w:pPr>
+        <w:pStyle w:val="ListBullet"/>
+      </w:pPr>
+      <w:r>
+        <w:t>AUTO-0055 - 告知事項 - Informações declaradas na contratação</w:t>
+      </w:r>
+    </w:p>
+    <w:p>
+      <w:pPr>
+        <w:pStyle w:val="ListBullet"/>
+      </w:pPr>
+      <w:r>
+        <w:t>AUTO-0056 - 通知義務 - Obrigação de comunicar alterações</w:t>
+      </w:r>
+    </w:p>
+    <w:p>
+      <w:pPr>
+        <w:pStyle w:val="ListBullet"/>
+      </w:pPr>
+      <w:r>
+        <w:t>AUTO-0057 - 変更手続き - Procedimento de alteração</w:t>
+      </w:r>
+    </w:p>
+    <w:p>
+      <w:pPr>
+        <w:pStyle w:val="ListBullet"/>
+      </w:pPr>
+      <w:r>
+        <w:t>AUTO-0058 - 保険証券 - Apólice de seguro</w:t>
+      </w:r>
+    </w:p>
+    <w:p>
+      <w:pPr>
+        <w:pStyle w:val="ListBullet"/>
+      </w:pPr>
+      <w:r>
+        <w:t>AUTO-0059 - 継続証 - Comprovante de renovação</w:t>
+      </w:r>
+    </w:p>
+    <w:p>
+      <w:pPr>
+        <w:pStyle w:val="ListBullet"/>
+      </w:pPr>
+      <w:r>
+        <w:t>AUTO-0060 - 中断証明書 - Certificado de interrupção</w:t>
+      </w:r>
+    </w:p>
+    <w:p>
+      <w:pPr>
         <w:pStyle w:val="Heading3"/>
       </w:pPr>
       <w:r>
@@ -1134,6 +1294,166 @@
     </w:p>
     <w:p>
       <w:pPr>
+        <w:pStyle w:val="ListBullet"/>
+      </w:pPr>
+      <w:r>
+        <w:t>FAQ-AUTO-0038 - Que informações preciso passar sobre o acidente?</w:t>
+      </w:r>
+    </w:p>
+    <w:p>
+      <w:pPr>
+        <w:pStyle w:val="ListBullet"/>
+      </w:pPr>
+      <w:r>
+        <w:t>FAQ-AUTO-0039 - Quais dados da outra parte devo anotar?</w:t>
+      </w:r>
+    </w:p>
+    <w:p>
+      <w:pPr>
+        <w:pStyle w:val="ListBullet"/>
+      </w:pPr>
+      <w:r>
+        <w:t>FAQ-AUTO-0040 - Como é definida a culpa no acidente?</w:t>
+      </w:r>
+    </w:p>
+    <w:p>
+      <w:pPr>
+        <w:pStyle w:val="ListBullet"/>
+      </w:pPr>
+      <w:r>
+        <w:t>FAQ-AUTO-0041 - Posso fazer acordo direto com a outra pessoa?</w:t>
+      </w:r>
+    </w:p>
+    <w:p>
+      <w:pPr>
+        <w:pStyle w:val="ListBullet"/>
+      </w:pPr>
+      <w:r>
+        <w:t>FAQ-AUTO-0042 - Quem paga os danos causados a terceiros?</w:t>
+      </w:r>
+    </w:p>
+    <w:p>
+      <w:pPr>
+        <w:pStyle w:val="ListBullet"/>
+      </w:pPr>
+      <w:r>
+        <w:t>FAQ-AUTO-0043 - Por que a seguradora pediu orçamento de reparo?</w:t>
+      </w:r>
+    </w:p>
+    <w:p>
+      <w:pPr>
+        <w:pStyle w:val="ListBullet"/>
+      </w:pPr>
+      <w:r>
+        <w:t>FAQ-AUTO-0044 - Por que a seguradora precisa avaliar os danos?</w:t>
+      </w:r>
+    </w:p>
+    <w:p>
+      <w:pPr>
+        <w:pStyle w:val="ListBullet"/>
+      </w:pPr>
+      <w:r>
+        <w:t>FAQ-AUTO-0045 - Quando o carro vira perda total?</w:t>
+      </w:r>
+    </w:p>
+    <w:p>
+      <w:pPr>
+        <w:pStyle w:val="ListBullet"/>
+      </w:pPr>
+      <w:r>
+        <w:t>FAQ-AUTO-0046 - O que acontece quando é perda parcial?</w:t>
+      </w:r>
+    </w:p>
+    <w:p>
+      <w:pPr>
+        <w:pStyle w:val="ListBullet"/>
+      </w:pPr>
+      <w:r>
+        <w:t>FAQ-AUTO-0047 - Posso chamar guincho pelo seguro?</w:t>
+      </w:r>
+    </w:p>
+    <w:p>
+      <w:pPr>
+        <w:pStyle w:val="ListBullet"/>
+      </w:pPr>
+      <w:r>
+        <w:t>FAQ-AUTO-0048 - Posso escolher a oficina?</w:t>
+      </w:r>
+    </w:p>
+    <w:p>
+      <w:pPr>
+        <w:pStyle w:val="ListBullet"/>
+      </w:pPr>
+      <w:r>
+        <w:t>FAQ-AUTO-0049 - Quem decide se o seguro cobre?</w:t>
+      </w:r>
+    </w:p>
+    <w:p>
+      <w:pPr>
+        <w:pStyle w:val="ListBullet"/>
+      </w:pPr>
+      <w:r>
+        <w:t>FAQ-AUTO-0050 - Qual é o papel da corretora?</w:t>
+      </w:r>
+    </w:p>
+    <w:p>
+      <w:pPr>
+        <w:pStyle w:val="ListBullet"/>
+      </w:pPr>
+      <w:r>
+        <w:t>FAQ-AUTO-0051 - A proposta já garante cobertura?</w:t>
+      </w:r>
+    </w:p>
+    <w:p>
+      <w:pPr>
+        <w:pStyle w:val="ListBullet"/>
+      </w:pPr>
+      <w:r>
+        <w:t>FAQ-AUTO-0052 - Por que preciso declarar tudo corretamente?</w:t>
+      </w:r>
+    </w:p>
+    <w:p>
+      <w:pPr>
+        <w:pStyle w:val="ListBullet"/>
+      </w:pPr>
+      <w:r>
+        <w:t>FAQ-AUTO-0053 - Quais mudanças preciso avisar à seguradora?</w:t>
+      </w:r>
+    </w:p>
+    <w:p>
+      <w:pPr>
+        <w:pStyle w:val="ListBullet"/>
+      </w:pPr>
+      <w:r>
+        <w:t>FAQ-AUTO-0054 - Como faço uma alteração no contrato?</w:t>
+      </w:r>
+    </w:p>
+    <w:p>
+      <w:pPr>
+        <w:pStyle w:val="ListBullet"/>
+      </w:pPr>
+      <w:r>
+        <w:t>FAQ-AUTO-0055 - Para que serve a apólice?</w:t>
+      </w:r>
+    </w:p>
+    <w:p>
+      <w:pPr>
+        <w:pStyle w:val="ListBullet"/>
+      </w:pPr>
+      <w:r>
+        <w:t>FAQ-AUTO-0056 - Como confirmo que a renovação foi feita?</w:t>
+      </w:r>
+    </w:p>
+    <w:p>
+      <w:pPr>
+        <w:pStyle w:val="ListBullet"/>
+      </w:pPr>
+      <w:r>
+        <w:t>FAQ-AUTO-0057 - Para que serve o certificado de interrupção?</w:t>
+      </w:r>
+    </w:p>
+    <w:p>
+      <w:pPr>
         <w:pStyle w:val="Heading3"/>
       </w:pPr>
       <w:r>
@@ -1254,6 +1574,54 @@
     </w:p>
     <w:p>
       <w:pPr>
+        <w:pStyle w:val="ListBullet"/>
+      </w:pPr>
+      <w:r>
+        <w:t>DIALOGUE-AUTO-0015 - Coletando circunstâncias e dados da outra parte</w:t>
+      </w:r>
+    </w:p>
+    <w:p>
+      <w:pPr>
+        <w:pStyle w:val="ListBullet"/>
+      </w:pPr>
+      <w:r>
+        <w:t>DIALOGUE-AUTO-0016 - Explicando responsabilidade, acordo e indenização</w:t>
+      </w:r>
+    </w:p>
+    <w:p>
+      <w:pPr>
+        <w:pStyle w:val="ListBullet"/>
+      </w:pPr>
+      <w:r>
+        <w:t>DIALOGUE-AUTO-0017 - Orientando orçamento, avaliação e tipo de perda</w:t>
+      </w:r>
+    </w:p>
+    <w:p>
+      <w:pPr>
+        <w:pStyle w:val="ListBullet"/>
+      </w:pPr>
+      <w:r>
+        <w:t>DIALOGUE-AUTO-0018 - Organizando guincho, oficina e contato com seguradora</w:t>
+      </w:r>
+    </w:p>
+    <w:p>
+      <w:pPr>
+        <w:pStyle w:val="ListBullet"/>
+      </w:pPr>
+      <w:r>
+        <w:t>DIALOGUE-AUTO-0019 - Conferindo proposta, declaração e obrigação de aviso</w:t>
+      </w:r>
+    </w:p>
+    <w:p>
+      <w:pPr>
+        <w:pStyle w:val="ListBullet"/>
+      </w:pPr>
+      <w:r>
+        <w:t>DIALOGUE-AUTO-0020 - Explicando apólice, renovação e interrupção</w:t>
+      </w:r>
+    </w:p>
+    <w:p>
+      <w:pPr>
         <w:pStyle w:val="Heading3"/>
       </w:pPr>
       <w:r>
@@ -1422,6 +1790,70 @@
     </w:p>
     <w:p>
       <w:pPr>
+        <w:pStyle w:val="ListBullet"/>
+      </w:pPr>
+      <w:r>
+        <w:t>CASE-AUTO-0021 - Cliente não sabe descrever as circunstâncias do acidente</w:t>
+      </w:r>
+    </w:p>
+    <w:p>
+      <w:pPr>
+        <w:pStyle w:val="ListBullet"/>
+      </w:pPr>
+      <w:r>
+        <w:t>CASE-AUTO-0022 - Cliente discorda do percentual de culpa</w:t>
+      </w:r>
+    </w:p>
+    <w:p>
+      <w:pPr>
+        <w:pStyle w:val="ListBullet"/>
+      </w:pPr>
+      <w:r>
+        <w:t>CASE-AUTO-0023 - Danos a terceiro exigem análise de indenização</w:t>
+      </w:r>
+    </w:p>
+    <w:p>
+      <w:pPr>
+        <w:pStyle w:val="ListBullet"/>
+      </w:pPr>
+      <w:r>
+        <w:t>CASE-AUTO-0024 - Seguradora solicita orçamento e avaliação de danos</w:t>
+      </w:r>
+    </w:p>
+    <w:p>
+      <w:pPr>
+        <w:pStyle w:val="ListBullet"/>
+      </w:pPr>
+      <w:r>
+        <w:t>CASE-AUTO-0025 - Cliente não entende diferença entre perda total e parcial</w:t>
+      </w:r>
+    </w:p>
+    <w:p>
+      <w:pPr>
+        <w:pStyle w:val="ListBullet"/>
+      </w:pPr>
+      <w:r>
+        <w:t>CASE-AUTO-0026 - Veículo precisa de guincho e oficina após pane ou acidente</w:t>
+      </w:r>
+    </w:p>
+    <w:p>
+      <w:pPr>
+        <w:pStyle w:val="ListBullet"/>
+      </w:pPr>
+      <w:r>
+        <w:t>CASE-AUTO-0027 - Informação incorreta na contratação causa risco contratual</w:t>
+      </w:r>
+    </w:p>
+    <w:p>
+      <w:pPr>
+        <w:pStyle w:val="ListBullet"/>
+      </w:pPr>
+      <w:r>
+        <w:t>CASE-AUTO-0028 - Cliente precisa comprovar apólice, renovação ou interrupção</w:t>
+      </w:r>
+    </w:p>
+    <w:p>
+      <w:pPr>
         <w:pStyle w:val="Heading2"/>
       </w:pPr>
       <w:r>
@@ -1534,6 +1966,21 @@
       </w:r>
     </w:p>
     <w:p>
+      <w:r>
+        <w:t>| Atendimento inicial de sinistro | AUTO-0041, AUTO-0042, AUTO-0043, AUTO-0044, AUTO-0045 | FAQ-AUTO-0038, FAQ-AUTO-0039, FAQ-AUTO-0040, FAQ-AUTO-0041, FAQ-AUTO-0042 | DIALOGUE-AUTO-0015, DIALOGUE-AUTO-0016 | CASE-AUTO-0021, CASE-AUTO-0022, CASE-AUTO-0023 |</w:t>
+      </w:r>
+    </w:p>
+    <w:p>
+      <w:r>
+        <w:t>| Reparo e avaliação de danos | AUTO-0046, AUTO-0047, AUTO-0048, AUTO-0049, AUTO-0050, AUTO-0051 | FAQ-AUTO-0043, FAQ-AUTO-0044, FAQ-AUTO-0045, FAQ-AUTO-0046, FAQ-AUTO-0047, FAQ-AUTO-0048 | DIALOGUE-AUTO-0017, DIALOGUE-AUTO-0018 | CASE-AUTO-0024, CASE-AUTO-0025, CASE-AUTO-0026 |</w:t>
+      </w:r>
+    </w:p>
+    <w:p>
+      <w:r>
+        <w:t>| Seguradora, corretora e documentos contratuais | AUTO-0052, AUTO-0053, AUTO-0054, AUTO-0055, AUTO-0056, AUTO-0057, AUTO-0058, AUTO-0059, AUTO-0060 | FAQ-AUTO-0049, FAQ-AUTO-0050, FAQ-AUTO-0051, FAQ-AUTO-0052, FAQ-AUTO-0053, FAQ-AUTO-0054, FAQ-AUTO-0055, FAQ-AUTO-0056, FAQ-AUTO-0057 | DIALOGUE-AUTO-0018, DIALOGUE-AUTO-0019, DIALOGUE-AUTO-0020 | CASE-AUTO-0026, CASE-AUTO-0027, CASE-AUTO-0028 |</w:t>
+      </w:r>
+    </w:p>
+    <w:p>
       <w:pPr>
         <w:pStyle w:val="Heading2"/>
       </w:pPr>
@@ -1727,6 +2174,38 @@
     </w:p>
     <w:p>
       <w:pPr>
+        <w:pStyle w:val="ListBullet"/>
+      </w:pPr>
+      <w:r>
+        <w:t>`19_Markdown/AUTO/AUTO_TERMS_0041_0060.md`</w:t>
+      </w:r>
+    </w:p>
+    <w:p>
+      <w:pPr>
+        <w:pStyle w:val="ListBullet"/>
+      </w:pPr>
+      <w:r>
+        <w:t>`19_Markdown/AUTO/AUTO_FAQ_0038_0057.md`</w:t>
+      </w:r>
+    </w:p>
+    <w:p>
+      <w:pPr>
+        <w:pStyle w:val="ListBullet"/>
+      </w:pPr>
+      <w:r>
+        <w:t>`19_Markdown/AUTO/AUTO_DIALOGUES_0015_0020.md`</w:t>
+      </w:r>
+    </w:p>
+    <w:p>
+      <w:pPr>
+        <w:pStyle w:val="ListBullet"/>
+      </w:pPr>
+      <w:r>
+        <w:t>`19_Markdown/AUTO/AUTO_CASES_0021_0028.md`</w:t>
+      </w:r>
+    </w:p>
+    <w:p>
+      <w:pPr>
         <w:pStyle w:val="Heading2"/>
       </w:pPr>
       <w:r>
@@ -1761,6 +2240,11 @@
     <w:p>
       <w:r>
         <w:t>| 2026-06-25 | 0.4 | JP-BR Insurance Knowledge Base | Inclusão do quarto lote AUTO. |</w:t>
+      </w:r>
+    </w:p>
+    <w:p>
+      <w:r>
+        <w:t>| 2026-06-25 | 0.5 | JP-BR Insurance Knowledge Base | Inclusão dos quinto e sexto lotes AUTO. |</w:t>
       </w:r>
     </w:p>
     <w:sectPr>

</xml_diff>

<commit_message>
Add automobile exclusions and special coverage cycle
</commit_message>
<xml_diff>
--- a/18_DOCX/AUTO_INDEX_0001.docx
+++ b/18_DOCX/AUTO_INDEX_0001.docx
@@ -990,6 +990,166 @@
     </w:p>
     <w:p>
       <w:pPr>
+        <w:pStyle w:val="ListBullet"/>
+      </w:pPr>
+      <w:r>
+        <w:t>AUTO-0061 - 免責事項 - Exclusões e limitações de cobertura</w:t>
+      </w:r>
+    </w:p>
+    <w:p>
+      <w:pPr>
+        <w:pStyle w:val="ListBullet"/>
+      </w:pPr>
+      <w:r>
+        <w:t>AUTO-0062 - 補償対象外 - Fora da cobertura</w:t>
+      </w:r>
+    </w:p>
+    <w:p>
+      <w:pPr>
+        <w:pStyle w:val="ListBullet"/>
+      </w:pPr>
+      <w:r>
+        <w:t>AUTO-0063 - 飲酒運転 - Direção sob efeito de álcool</w:t>
+      </w:r>
+    </w:p>
+    <w:p>
+      <w:pPr>
+        <w:pStyle w:val="ListBullet"/>
+      </w:pPr>
+      <w:r>
+        <w:t>AUTO-0064 - 無免許運転 - Direção sem habilitação</w:t>
+      </w:r>
+    </w:p>
+    <w:p>
+      <w:pPr>
+        <w:pStyle w:val="ListBullet"/>
+      </w:pPr>
+      <w:r>
+        <w:t>AUTO-0065 - 重大な過失 - Culpa grave</w:t>
+      </w:r>
+    </w:p>
+    <w:p>
+      <w:pPr>
+        <w:pStyle w:val="ListBullet"/>
+      </w:pPr>
+      <w:r>
+        <w:t>AUTO-0066 - 故意 - Ato intencional</w:t>
+      </w:r>
+    </w:p>
+    <w:p>
+      <w:pPr>
+        <w:pStyle w:val="ListBullet"/>
+      </w:pPr>
+      <w:r>
+        <w:t>AUTO-0067 - 地震 - Terremoto</w:t>
+      </w:r>
+    </w:p>
+    <w:p>
+      <w:pPr>
+        <w:pStyle w:val="ListBullet"/>
+      </w:pPr>
+      <w:r>
+        <w:t>AUTO-0068 - 台風 - Tufão</w:t>
+      </w:r>
+    </w:p>
+    <w:p>
+      <w:pPr>
+        <w:pStyle w:val="ListBullet"/>
+      </w:pPr>
+      <w:r>
+        <w:t>AUTO-0069 - 洪水 - Inundação</w:t>
+      </w:r>
+    </w:p>
+    <w:p>
+      <w:pPr>
+        <w:pStyle w:val="ListBullet"/>
+      </w:pPr>
+      <w:r>
+        <w:t>AUTO-0070 - 盗難 - Roubo ou furto do veículo</w:t>
+      </w:r>
+    </w:p>
+    <w:p>
+      <w:pPr>
+        <w:pStyle w:val="ListBullet"/>
+      </w:pPr>
+      <w:r>
+        <w:t>AUTO-0071 - いたずら - Vandalismo</w:t>
+      </w:r>
+    </w:p>
+    <w:p>
+      <w:pPr>
+        <w:pStyle w:val="ListBullet"/>
+      </w:pPr>
+      <w:r>
+        <w:t>AUTO-0072 - 飛び石 - Dano por pedra lançada</w:t>
+      </w:r>
+    </w:p>
+    <w:p>
+      <w:pPr>
+        <w:pStyle w:val="ListBullet"/>
+      </w:pPr>
+      <w:r>
+        <w:t>AUTO-0073 - 自然災害 - Desastre natural</w:t>
+      </w:r>
+    </w:p>
+    <w:p>
+      <w:pPr>
+        <w:pStyle w:val="ListBullet"/>
+      </w:pPr>
+      <w:r>
+        <w:t>AUTO-0074 - 使用者 - Usuário do veículo</w:t>
+      </w:r>
+    </w:p>
+    <w:p>
+      <w:pPr>
+        <w:pStyle w:val="ListBullet"/>
+      </w:pPr>
+      <w:r>
+        <w:t>AUTO-0075 - 記名被保険者 - Segurado principal nomeado</w:t>
+      </w:r>
+    </w:p>
+    <w:p>
+      <w:pPr>
+        <w:pStyle w:val="ListBullet"/>
+      </w:pPr>
+      <w:r>
+        <w:t>AUTO-0076 - 家族限定 - Restrição a familiares</w:t>
+      </w:r>
+    </w:p>
+    <w:p>
+      <w:pPr>
+        <w:pStyle w:val="ListBullet"/>
+      </w:pPr>
+      <w:r>
+        <w:t>AUTO-0077 - 夫婦限定 - Restrição a casal</w:t>
+      </w:r>
+    </w:p>
+    <w:p>
+      <w:pPr>
+        <w:pStyle w:val="ListBullet"/>
+      </w:pPr>
+      <w:r>
+        <w:t>AUTO-0078 - 他車運転特約 - Cobertura adicional para dirigir outro veículo</w:t>
+      </w:r>
+    </w:p>
+    <w:p>
+      <w:pPr>
+        <w:pStyle w:val="ListBullet"/>
+      </w:pPr>
+      <w:r>
+        <w:t>AUTO-0079 - ファミリーバイク特約 - Cobertura adicional para moto pequena da família</w:t>
+      </w:r>
+    </w:p>
+    <w:p>
+      <w:pPr>
+        <w:pStyle w:val="ListBullet"/>
+      </w:pPr>
+      <w:r>
+        <w:t>AUTO-0080 - 個人賠償責任特約 - Cobertura adicional de responsabilidade civil pessoal</w:t>
+      </w:r>
+    </w:p>
+    <w:p>
+      <w:pPr>
         <w:pStyle w:val="Heading3"/>
       </w:pPr>
       <w:r>
@@ -1454,6 +1614,166 @@
     </w:p>
     <w:p>
       <w:pPr>
+        <w:pStyle w:val="ListBullet"/>
+      </w:pPr>
+      <w:r>
+        <w:t>FAQ-AUTO-0058 - O que são exclusões do seguro?</w:t>
+      </w:r>
+    </w:p>
+    <w:p>
+      <w:pPr>
+        <w:pStyle w:val="ListBullet"/>
+      </w:pPr>
+      <w:r>
+        <w:t>FAQ-AUTO-0059 - Como sei se uma situação está fora da cobertura?</w:t>
+      </w:r>
+    </w:p>
+    <w:p>
+      <w:pPr>
+        <w:pStyle w:val="ListBullet"/>
+      </w:pPr>
+      <w:r>
+        <w:t>FAQ-AUTO-0060 - O seguro cobre acidente se o motorista bebeu?</w:t>
+      </w:r>
+    </w:p>
+    <w:p>
+      <w:pPr>
+        <w:pStyle w:val="ListBullet"/>
+      </w:pPr>
+      <w:r>
+        <w:t>FAQ-AUTO-0061 - O que acontece se o motorista não tinha habilitação válida?</w:t>
+      </w:r>
+    </w:p>
+    <w:p>
+      <w:pPr>
+        <w:pStyle w:val="ListBullet"/>
+      </w:pPr>
+      <w:r>
+        <w:t>FAQ-AUTO-0062 - Culpa grave pode afetar a cobertura?</w:t>
+      </w:r>
+    </w:p>
+    <w:p>
+      <w:pPr>
+        <w:pStyle w:val="ListBullet"/>
+      </w:pPr>
+      <w:r>
+        <w:t>FAQ-AUTO-0063 - Dano causado de propósito é coberto?</w:t>
+      </w:r>
+    </w:p>
+    <w:p>
+      <w:pPr>
+        <w:pStyle w:val="ListBullet"/>
+      </w:pPr>
+      <w:r>
+        <w:t>FAQ-AUTO-0064 - Dano por terremoto é coberto?</w:t>
+      </w:r>
+    </w:p>
+    <w:p>
+      <w:pPr>
+        <w:pStyle w:val="ListBullet"/>
+      </w:pPr>
+      <w:r>
+        <w:t>FAQ-AUTO-0065 - Dano por tufão é coberto?</w:t>
+      </w:r>
+    </w:p>
+    <w:p>
+      <w:pPr>
+        <w:pStyle w:val="ListBullet"/>
+      </w:pPr>
+      <w:r>
+        <w:t>FAQ-AUTO-0066 - Dano por inundação ou enchente é coberto?</w:t>
+      </w:r>
+    </w:p>
+    <w:p>
+      <w:pPr>
+        <w:pStyle w:val="ListBullet"/>
+      </w:pPr>
+      <w:r>
+        <w:t>FAQ-AUTO-0067 - O seguro cobre roubo ou furto do veículo?</w:t>
+      </w:r>
+    </w:p>
+    <w:p>
+      <w:pPr>
+        <w:pStyle w:val="ListBullet"/>
+      </w:pPr>
+      <w:r>
+        <w:t>FAQ-AUTO-0068 - Vandalismo pode ser coberto?</w:t>
+      </w:r>
+    </w:p>
+    <w:p>
+      <w:pPr>
+        <w:pStyle w:val="ListBullet"/>
+      </w:pPr>
+      <w:r>
+        <w:t>FAQ-AUTO-0069 - Dano por pedra no para-brisa é coberto?</w:t>
+      </w:r>
+    </w:p>
+    <w:p>
+      <w:pPr>
+        <w:pStyle w:val="ListBullet"/>
+      </w:pPr>
+      <w:r>
+        <w:t>FAQ-AUTO-0070 - Todo desastre natural entra no seguro?</w:t>
+      </w:r>
+    </w:p>
+    <w:p>
+      <w:pPr>
+        <w:pStyle w:val="ListBullet"/>
+      </w:pPr>
+      <w:r>
+        <w:t>FAQ-AUTO-0071 - Por que preciso informar quem usa o carro?</w:t>
+      </w:r>
+    </w:p>
+    <w:p>
+      <w:pPr>
+        <w:pStyle w:val="ListBullet"/>
+      </w:pPr>
+      <w:r>
+        <w:t>FAQ-AUTO-0072 - Quem deve ser o segurado principal?</w:t>
+      </w:r>
+    </w:p>
+    <w:p>
+      <w:pPr>
+        <w:pStyle w:val="ListBullet"/>
+      </w:pPr>
+      <w:r>
+        <w:t>FAQ-AUTO-0073 - O que significa restrição a familiares?</w:t>
+      </w:r>
+    </w:p>
+    <w:p>
+      <w:pPr>
+        <w:pStyle w:val="ListBullet"/>
+      </w:pPr>
+      <w:r>
+        <w:t>FAQ-AUTO-0074 - O que significa restrição ao casal?</w:t>
+      </w:r>
+    </w:p>
+    <w:p>
+      <w:pPr>
+        <w:pStyle w:val="ListBullet"/>
+      </w:pPr>
+      <w:r>
+        <w:t>FAQ-AUTO-0075 - Estou coberto se dirigir outro carro?</w:t>
+      </w:r>
+    </w:p>
+    <w:p>
+      <w:pPr>
+        <w:pStyle w:val="ListBullet"/>
+      </w:pPr>
+      <w:r>
+        <w:t>FAQ-AUTO-0076 - A cobertura para moto pequena da família está incluída automaticamente?</w:t>
+      </w:r>
+    </w:p>
+    <w:p>
+      <w:pPr>
+        <w:pStyle w:val="ListBullet"/>
+      </w:pPr>
+      <w:r>
+        <w:t>FAQ-AUTO-0077 - Para que serve a cobertura de responsabilidade civil pessoal?</w:t>
+      </w:r>
+    </w:p>
+    <w:p>
+      <w:pPr>
         <w:pStyle w:val="Heading3"/>
       </w:pPr>
       <w:r>
@@ -1622,6 +1942,54 @@
     </w:p>
     <w:p>
       <w:pPr>
+        <w:pStyle w:val="ListBullet"/>
+      </w:pPr>
+      <w:r>
+        <w:t>DIALOGUE-AUTO-0021 - Explicando exclusões, fora de cobertura e condutas graves</w:t>
+      </w:r>
+    </w:p>
+    <w:p>
+      <w:pPr>
+        <w:pStyle w:val="ListBullet"/>
+      </w:pPr>
+      <w:r>
+        <w:t>DIALOGUE-AUTO-0022 - Orientando culpa grave, ato intencional e acordo com seguradora</w:t>
+      </w:r>
+    </w:p>
+    <w:p>
+      <w:pPr>
+        <w:pStyle w:val="ListBullet"/>
+      </w:pPr>
+      <w:r>
+        <w:t>DIALOGUE-AUTO-0023 - Explicando terremoto, tufão, inundação e desastre natural</w:t>
+      </w:r>
+    </w:p>
+    <w:p>
+      <w:pPr>
+        <w:pStyle w:val="ListBullet"/>
+      </w:pPr>
+      <w:r>
+        <w:t>DIALOGUE-AUTO-0024 - Orientando roubo, vandalismo e dano por pedra</w:t>
+      </w:r>
+    </w:p>
+    <w:p>
+      <w:pPr>
+        <w:pStyle w:val="ListBullet"/>
+      </w:pPr>
+      <w:r>
+        <w:t>DIALOGUE-AUTO-0025 - Conferindo usuário, segurado principal e restrições de condutor</w:t>
+      </w:r>
+    </w:p>
+    <w:p>
+      <w:pPr>
+        <w:pStyle w:val="ListBullet"/>
+      </w:pPr>
+      <w:r>
+        <w:t>DIALOGUE-AUTO-0026 - Explicando coberturas adicionais especiais</w:t>
+      </w:r>
+    </w:p>
+    <w:p>
+      <w:pPr>
         <w:pStyle w:val="Heading3"/>
       </w:pPr>
       <w:r>
@@ -1854,6 +2222,70 @@
     </w:p>
     <w:p>
       <w:pPr>
+        <w:pStyle w:val="ListBullet"/>
+      </w:pPr>
+      <w:r>
+        <w:t>CASE-AUTO-0029 - Cliente acredita que qualquer acidente está coberto</w:t>
+      </w:r>
+    </w:p>
+    <w:p>
+      <w:pPr>
+        <w:pStyle w:val="ListBullet"/>
+      </w:pPr>
+      <w:r>
+        <w:t>CASE-AUTO-0030 - Acidente com suspeita de álcool ou falta de habilitação</w:t>
+      </w:r>
+    </w:p>
+    <w:p>
+      <w:pPr>
+        <w:pStyle w:val="ListBullet"/>
+      </w:pPr>
+      <w:r>
+        <w:t>CASE-AUTO-0031 - Dano com possível culpa grave ou ato intencional</w:t>
+      </w:r>
+    </w:p>
+    <w:p>
+      <w:pPr>
+        <w:pStyle w:val="ListBullet"/>
+      </w:pPr>
+      <w:r>
+        <w:t>CASE-AUTO-0032 - Veículo danificado por tufão ou inundação</w:t>
+      </w:r>
+    </w:p>
+    <w:p>
+      <w:pPr>
+        <w:pStyle w:val="ListBullet"/>
+      </w:pPr>
+      <w:r>
+        <w:t>CASE-AUTO-0033 - Cliente pergunta sobre dano por terremoto</w:t>
+      </w:r>
+    </w:p>
+    <w:p>
+      <w:pPr>
+        <w:pStyle w:val="ListBullet"/>
+      </w:pPr>
+      <w:r>
+        <w:t>CASE-AUTO-0034 - Roubo, vandalismo ou dano por pedra no veículo</w:t>
+      </w:r>
+    </w:p>
+    <w:p>
+      <w:pPr>
+        <w:pStyle w:val="ListBullet"/>
+      </w:pPr>
+      <w:r>
+        <w:t>CASE-AUTO-0035 - Motorista fora da restrição familiar ou de casal</w:t>
+      </w:r>
+    </w:p>
+    <w:p>
+      <w:pPr>
+        <w:pStyle w:val="ListBullet"/>
+      </w:pPr>
+      <w:r>
+        <w:t>CASE-AUTO-0036 - Cliente presume que coberturas adicionais já estão incluídas</w:t>
+      </w:r>
+    </w:p>
+    <w:p>
+      <w:pPr>
         <w:pStyle w:val="Heading2"/>
       </w:pPr>
       <w:r>
@@ -1981,6 +2413,21 @@
       </w:r>
     </w:p>
     <w:p>
+      <w:r>
+        <w:t>| Exclusões e condutas graves | AUTO-0061, AUTO-0062, AUTO-0063, AUTO-0064, AUTO-0065, AUTO-0066 | FAQ-AUTO-0058, FAQ-AUTO-0059, FAQ-AUTO-0060, FAQ-AUTO-0061, FAQ-AUTO-0062, FAQ-AUTO-0063 | DIALOGUE-AUTO-0021, DIALOGUE-AUTO-0022 | CASE-AUTO-0029, CASE-AUTO-0030, CASE-AUTO-0031 |</w:t>
+      </w:r>
+    </w:p>
+    <w:p>
+      <w:r>
+        <w:t>| Desastres naturais e danos externos | AUTO-0067, AUTO-0068, AUTO-0069, AUTO-0070, AUTO-0071, AUTO-0072, AUTO-0073 | FAQ-AUTO-0064, FAQ-AUTO-0065, FAQ-AUTO-0066, FAQ-AUTO-0067, FAQ-AUTO-0068, FAQ-AUTO-0069, FAQ-AUTO-0070 | DIALOGUE-AUTO-0023, DIALOGUE-AUTO-0024 | CASE-AUTO-0032, CASE-AUTO-0033, CASE-AUTO-0034 |</w:t>
+      </w:r>
+    </w:p>
+    <w:p>
+      <w:r>
+        <w:t>| Usuários, restrições e coberturas adicionais | AUTO-0074, AUTO-0075, AUTO-0076, AUTO-0077, AUTO-0078, AUTO-0079, AUTO-0080 | FAQ-AUTO-0071, FAQ-AUTO-0072, FAQ-AUTO-0073, FAQ-AUTO-0074, FAQ-AUTO-0075, FAQ-AUTO-0076, FAQ-AUTO-0077 | DIALOGUE-AUTO-0025, DIALOGUE-AUTO-0026 | CASE-AUTO-0035, CASE-AUTO-0036 |</w:t>
+      </w:r>
+    </w:p>
+    <w:p>
       <w:pPr>
         <w:pStyle w:val="Heading2"/>
       </w:pPr>
@@ -2206,6 +2653,38 @@
     </w:p>
     <w:p>
       <w:pPr>
+        <w:pStyle w:val="ListBullet"/>
+      </w:pPr>
+      <w:r>
+        <w:t>`19_Markdown/AUTO/AUTO_TERMS_0061_0080.md`</w:t>
+      </w:r>
+    </w:p>
+    <w:p>
+      <w:pPr>
+        <w:pStyle w:val="ListBullet"/>
+      </w:pPr>
+      <w:r>
+        <w:t>`19_Markdown/AUTO/AUTO_FAQ_0058_0077.md`</w:t>
+      </w:r>
+    </w:p>
+    <w:p>
+      <w:pPr>
+        <w:pStyle w:val="ListBullet"/>
+      </w:pPr>
+      <w:r>
+        <w:t>`19_Markdown/AUTO/AUTO_DIALOGUES_0021_0026.md`</w:t>
+      </w:r>
+    </w:p>
+    <w:p>
+      <w:pPr>
+        <w:pStyle w:val="ListBullet"/>
+      </w:pPr>
+      <w:r>
+        <w:t>`19_Markdown/AUTO/AUTO_CASES_0029_0036.md`</w:t>
+      </w:r>
+    </w:p>
+    <w:p>
+      <w:pPr>
         <w:pStyle w:val="Heading2"/>
       </w:pPr>
       <w:r>
@@ -2245,6 +2724,11 @@
     <w:p>
       <w:r>
         <w:t>| 2026-06-25 | 0.5 | JP-BR Insurance Knowledge Base | Inclusão dos quinto e sexto lotes AUTO. |</w:t>
+      </w:r>
+    </w:p>
+    <w:p>
+      <w:r>
+        <w:t>| 2026-06-25 | 0.6 | JP-BR Insurance Knowledge Base | Inclusão dos sétimo e oitavo lotes AUTO. |</w:t>
       </w:r>
     </w:p>
     <w:sectPr>

</xml_diff>

<commit_message>
Add automobile review and after-sales cycle
</commit_message>
<xml_diff>
--- a/18_DOCX/AUTO_INDEX_0001.docx
+++ b/18_DOCX/AUTO_INDEX_0001.docx
@@ -1150,6 +1150,166 @@
     </w:p>
     <w:p>
       <w:pPr>
+        <w:pStyle w:val="ListBullet"/>
+      </w:pPr>
+      <w:r>
+        <w:t>AUTO-0081 - 補償の見直し - Revisão das coberturas</w:t>
+      </w:r>
+    </w:p>
+    <w:p>
+      <w:pPr>
+        <w:pStyle w:val="ListBullet"/>
+      </w:pPr>
+      <w:r>
+        <w:t>AUTO-0082 - 保険料の見直し - Revisão do prêmio do seguro</w:t>
+      </w:r>
+    </w:p>
+    <w:p>
+      <w:pPr>
+        <w:pStyle w:val="ListBullet"/>
+      </w:pPr>
+      <w:r>
+        <w:t>AUTO-0083 - 契約条件 - Condições do contrato</w:t>
+      </w:r>
+    </w:p>
+    <w:p>
+      <w:pPr>
+        <w:pStyle w:val="ListBullet"/>
+      </w:pPr>
+      <w:r>
+        <w:t>AUTO-0084 - 重要事項説明 - Explicação de informações importantes</w:t>
+      </w:r>
+    </w:p>
+    <w:p>
+      <w:pPr>
+        <w:pStyle w:val="ListBullet"/>
+      </w:pPr>
+      <w:r>
+        <w:t>AUTO-0085 - 契約概要 - Resumo do contrato</w:t>
+      </w:r>
+    </w:p>
+    <w:p>
+      <w:pPr>
+        <w:pStyle w:val="ListBullet"/>
+      </w:pPr>
+      <w:r>
+        <w:t>AUTO-0086 - 注意喚起情報 - Informações de alerta</w:t>
+      </w:r>
+    </w:p>
+    <w:p>
+      <w:pPr>
+        <w:pStyle w:val="ListBullet"/>
+      </w:pPr>
+      <w:r>
+        <w:t>AUTO-0087 - 契約確認 - Confirmação do contrato</w:t>
+      </w:r>
+    </w:p>
+    <w:p>
+      <w:pPr>
+        <w:pStyle w:val="ListBullet"/>
+      </w:pPr>
+      <w:r>
+        <w:t>AUTO-0088 - 顧客情報 - Informações do cliente</w:t>
+      </w:r>
+    </w:p>
+    <w:p>
+      <w:pPr>
+        <w:pStyle w:val="ListBullet"/>
+      </w:pPr>
+      <w:r>
+        <w:t>AUTO-0089 - 車両情報 - Informações do veículo</w:t>
+      </w:r>
+    </w:p>
+    <w:p>
+      <w:pPr>
+        <w:pStyle w:val="ListBullet"/>
+      </w:pPr>
+      <w:r>
+        <w:t>AUTO-0090 - 運転者情報 - Informações do condutor</w:t>
+      </w:r>
+    </w:p>
+    <w:p>
+      <w:pPr>
+        <w:pStyle w:val="ListBullet"/>
+      </w:pPr>
+      <w:r>
+        <w:t>AUTO-0091 - 事故対応フロー - Fluxo de atendimento em acidente</w:t>
+      </w:r>
+    </w:p>
+    <w:p>
+      <w:pPr>
+        <w:pStyle w:val="ListBullet"/>
+      </w:pPr>
+      <w:r>
+        <w:t>AUTO-0092 - 必要書類 - Documentos necessários</w:t>
+      </w:r>
+    </w:p>
+    <w:p>
+      <w:pPr>
+        <w:pStyle w:val="ListBullet"/>
+      </w:pPr>
+      <w:r>
+        <w:t>AUTO-0093 - 本人確認 - Confirmação de identidade</w:t>
+      </w:r>
+    </w:p>
+    <w:p>
+      <w:pPr>
+        <w:pStyle w:val="ListBullet"/>
+      </w:pPr>
+      <w:r>
+        <w:t>AUTO-0094 - 住所変更 - Alteração de endereço</w:t>
+      </w:r>
+    </w:p>
+    <w:p>
+      <w:pPr>
+        <w:pStyle w:val="ListBullet"/>
+      </w:pPr>
+      <w:r>
+        <w:t>AUTO-0095 - 連絡先変更 - Alteração de contato</w:t>
+      </w:r>
+    </w:p>
+    <w:p>
+      <w:pPr>
+        <w:pStyle w:val="ListBullet"/>
+      </w:pPr>
+      <w:r>
+        <w:t>AUTO-0096 - 名義変更 - Alteração de titularidade</w:t>
+      </w:r>
+    </w:p>
+    <w:p>
+      <w:pPr>
+        <w:pStyle w:val="ListBullet"/>
+      </w:pPr>
+      <w:r>
+        <w:t>AUTO-0097 - 解約手続き - Procedimento de cancelamento</w:t>
+      </w:r>
+    </w:p>
+    <w:p>
+      <w:pPr>
+        <w:pStyle w:val="ListBullet"/>
+      </w:pPr>
+      <w:r>
+        <w:t>AUTO-0098 - 更新案内 - Aviso de renovação</w:t>
+      </w:r>
+    </w:p>
+    <w:p>
+      <w:pPr>
+        <w:pStyle w:val="ListBullet"/>
+      </w:pPr>
+      <w:r>
+        <w:t>AUTO-0099 - 満期管理 - Controle de vencimento</w:t>
+      </w:r>
+    </w:p>
+    <w:p>
+      <w:pPr>
+        <w:pStyle w:val="ListBullet"/>
+      </w:pPr>
+      <w:r>
+        <w:t>AUTO-0100 - アフターサービス - Atendimento pós-venda</w:t>
+      </w:r>
+    </w:p>
+    <w:p>
+      <w:pPr>
         <w:pStyle w:val="Heading3"/>
       </w:pPr>
       <w:r>
@@ -1774,6 +1934,166 @@
     </w:p>
     <w:p>
       <w:pPr>
+        <w:pStyle w:val="ListBullet"/>
+      </w:pPr>
+      <w:r>
+        <w:t>FAQ-AUTO-0078 - Quando devo revisar as coberturas do seguro?</w:t>
+      </w:r>
+    </w:p>
+    <w:p>
+      <w:pPr>
+        <w:pStyle w:val="ListBullet"/>
+      </w:pPr>
+      <w:r>
+        <w:t>FAQ-AUTO-0079 - Como posso revisar o valor do seguro?</w:t>
+      </w:r>
+    </w:p>
+    <w:p>
+      <w:pPr>
+        <w:pStyle w:val="ListBullet"/>
+      </w:pPr>
+      <w:r>
+        <w:t>FAQ-AUTO-0080 - O que são condições do contrato?</w:t>
+      </w:r>
+    </w:p>
+    <w:p>
+      <w:pPr>
+        <w:pStyle w:val="ListBullet"/>
+      </w:pPr>
+      <w:r>
+        <w:t>FAQ-AUTO-0081 - Por que preciso ouvir a explicação de informações importantes?</w:t>
+      </w:r>
+    </w:p>
+    <w:p>
+      <w:pPr>
+        <w:pStyle w:val="ListBullet"/>
+      </w:pPr>
+      <w:r>
+        <w:t>FAQ-AUTO-0082 - O resumo do contrato é suficiente para entender o seguro?</w:t>
+      </w:r>
+    </w:p>
+    <w:p>
+      <w:pPr>
+        <w:pStyle w:val="ListBullet"/>
+      </w:pPr>
+      <w:r>
+        <w:t>FAQ-AUTO-0083 - Quais avisos importantes devo observar?</w:t>
+      </w:r>
+    </w:p>
+    <w:p>
+      <w:pPr>
+        <w:pStyle w:val="ListBullet"/>
+      </w:pPr>
+      <w:r>
+        <w:t>FAQ-AUTO-0084 - O que devo conferir antes de finalizar o contrato?</w:t>
+      </w:r>
+    </w:p>
+    <w:p>
+      <w:pPr>
+        <w:pStyle w:val="ListBullet"/>
+      </w:pPr>
+      <w:r>
+        <w:t>FAQ-AUTO-0085 - Por que meus dados pessoais precisam estar atualizados?</w:t>
+      </w:r>
+    </w:p>
+    <w:p>
+      <w:pPr>
+        <w:pStyle w:val="ListBullet"/>
+      </w:pPr>
+      <w:r>
+        <w:t>FAQ-AUTO-0086 - Por que os dados do veículo precisam estar corretos?</w:t>
+      </w:r>
+    </w:p>
+    <w:p>
+      <w:pPr>
+        <w:pStyle w:val="ListBullet"/>
+      </w:pPr>
+      <w:r>
+        <w:t>FAQ-AUTO-0087 - Por que preciso informar quem dirige o carro?</w:t>
+      </w:r>
+    </w:p>
+    <w:p>
+      <w:pPr>
+        <w:pStyle w:val="ListBullet"/>
+      </w:pPr>
+      <w:r>
+        <w:t>FAQ-AUTO-0088 - Qual é o passo a passo depois de um acidente?</w:t>
+      </w:r>
+    </w:p>
+    <w:p>
+      <w:pPr>
+        <w:pStyle w:val="ListBullet"/>
+      </w:pPr>
+      <w:r>
+        <w:t>FAQ-AUTO-0089 - Quais documentos preciso enviar?</w:t>
+      </w:r>
+    </w:p>
+    <w:p>
+      <w:pPr>
+        <w:pStyle w:val="ListBullet"/>
+      </w:pPr>
+      <w:r>
+        <w:t>FAQ-AUTO-0090 - Por que preciso confirmar minha identidade?</w:t>
+      </w:r>
+    </w:p>
+    <w:p>
+      <w:pPr>
+        <w:pStyle w:val="ListBullet"/>
+      </w:pPr>
+      <w:r>
+        <w:t>FAQ-AUTO-0091 - Mudei de endereço. Preciso avisar?</w:t>
+      </w:r>
+    </w:p>
+    <w:p>
+      <w:pPr>
+        <w:pStyle w:val="ListBullet"/>
+      </w:pPr>
+      <w:r>
+        <w:t>FAQ-AUTO-0092 - Troquei telefone ou e-mail. Preciso atualizar?</w:t>
+      </w:r>
+    </w:p>
+    <w:p>
+      <w:pPr>
+        <w:pStyle w:val="ListBullet"/>
+      </w:pPr>
+      <w:r>
+        <w:t>FAQ-AUTO-0093 - Posso mudar o titular do seguro?</w:t>
+      </w:r>
+    </w:p>
+    <w:p>
+      <w:pPr>
+        <w:pStyle w:val="ListBullet"/>
+      </w:pPr>
+      <w:r>
+        <w:t>FAQ-AUTO-0094 - Como faço para cancelar o seguro?</w:t>
+      </w:r>
+    </w:p>
+    <w:p>
+      <w:pPr>
+        <w:pStyle w:val="ListBullet"/>
+      </w:pPr>
+      <w:r>
+        <w:t>FAQ-AUTO-0095 - Quando recebo aviso de renovação?</w:t>
+      </w:r>
+    </w:p>
+    <w:p>
+      <w:pPr>
+        <w:pStyle w:val="ListBullet"/>
+      </w:pPr>
+      <w:r>
+        <w:t>FAQ-AUTO-0096 - Como evitar que o seguro vença sem perceber?</w:t>
+      </w:r>
+    </w:p>
+    <w:p>
+      <w:pPr>
+        <w:pStyle w:val="ListBullet"/>
+      </w:pPr>
+      <w:r>
+        <w:t>FAQ-AUTO-0097 - O que a corretora faz depois que o seguro é contratado?</w:t>
+      </w:r>
+    </w:p>
+    <w:p>
+      <w:pPr>
         <w:pStyle w:val="Heading3"/>
       </w:pPr>
       <w:r>
@@ -1990,6 +2310,54 @@
     </w:p>
     <w:p>
       <w:pPr>
+        <w:pStyle w:val="ListBullet"/>
+      </w:pPr>
+      <w:r>
+        <w:t>DIALOGUE-AUTO-0027 - Revisando coberturas, prêmio e condições do contrato</w:t>
+      </w:r>
+    </w:p>
+    <w:p>
+      <w:pPr>
+        <w:pStyle w:val="ListBullet"/>
+      </w:pPr>
+      <w:r>
+        <w:t>DIALOGUE-AUTO-0028 - Explicando resumo do contrato e informações de alerta</w:t>
+      </w:r>
+    </w:p>
+    <w:p>
+      <w:pPr>
+        <w:pStyle w:val="ListBullet"/>
+      </w:pPr>
+      <w:r>
+        <w:t>DIALOGUE-AUTO-0029 - Conferindo dados do cliente, veículo e condutores</w:t>
+      </w:r>
+    </w:p>
+    <w:p>
+      <w:pPr>
+        <w:pStyle w:val="ListBullet"/>
+      </w:pPr>
+      <w:r>
+        <w:t>DIALOGUE-AUTO-0030 - Orientando fluxo de acidente e documentos necessários</w:t>
+      </w:r>
+    </w:p>
+    <w:p>
+      <w:pPr>
+        <w:pStyle w:val="ListBullet"/>
+      </w:pPr>
+      <w:r>
+        <w:t>DIALOGUE-AUTO-0031 - Atualizando endereço, contato e titularidade</w:t>
+      </w:r>
+    </w:p>
+    <w:p>
+      <w:pPr>
+        <w:pStyle w:val="ListBullet"/>
+      </w:pPr>
+      <w:r>
+        <w:t>DIALOGUE-AUTO-0032 - Explicando cancelamento, renovação e pós-venda</w:t>
+      </w:r>
+    </w:p>
+    <w:p>
+      <w:pPr>
         <w:pStyle w:val="Heading3"/>
       </w:pPr>
       <w:r>
@@ -2286,6 +2654,70 @@
     </w:p>
     <w:p>
       <w:pPr>
+        <w:pStyle w:val="ListBullet"/>
+      </w:pPr>
+      <w:r>
+        <w:t>CASE-AUTO-0037 - Cliente quer reduzir preço sem perder proteção essencial</w:t>
+      </w:r>
+    </w:p>
+    <w:p>
+      <w:pPr>
+        <w:pStyle w:val="ListBullet"/>
+      </w:pPr>
+      <w:r>
+        <w:t>CASE-AUTO-0038 - Cliente não leu informações importantes antes de contratar</w:t>
+      </w:r>
+    </w:p>
+    <w:p>
+      <w:pPr>
+        <w:pStyle w:val="ListBullet"/>
+      </w:pPr>
+      <w:r>
+        <w:t>CASE-AUTO-0039 - Dados do cliente, veículo ou condutor estão incorretos</w:t>
+      </w:r>
+    </w:p>
+    <w:p>
+      <w:pPr>
+        <w:pStyle w:val="ListBullet"/>
+      </w:pPr>
+      <w:r>
+        <w:t>CASE-AUTO-0040 - Cliente não sabe o fluxo correto após acidente</w:t>
+      </w:r>
+    </w:p>
+    <w:p>
+      <w:pPr>
+        <w:pStyle w:val="ListBullet"/>
+      </w:pPr>
+      <w:r>
+        <w:t>CASE-AUTO-0041 - Seguradora pede confirmação de identidade e documentos</w:t>
+      </w:r>
+    </w:p>
+    <w:p>
+      <w:pPr>
+        <w:pStyle w:val="ListBullet"/>
+      </w:pPr>
+      <w:r>
+        <w:t>CASE-AUTO-0042 - Cliente mudou endereço, contato ou titularidade</w:t>
+      </w:r>
+    </w:p>
+    <w:p>
+      <w:pPr>
+        <w:pStyle w:val="ListBullet"/>
+      </w:pPr>
+      <w:r>
+        <w:t>CASE-AUTO-0043 - Cliente quer cancelar perto da renovação</w:t>
+      </w:r>
+    </w:p>
+    <w:p>
+      <w:pPr>
+        <w:pStyle w:val="ListBullet"/>
+      </w:pPr>
+      <w:r>
+        <w:t>CASE-AUTO-0044 - Pós-venda evita vencimento e problemas futuros</w:t>
+      </w:r>
+    </w:p>
+    <w:p>
+      <w:pPr>
         <w:pStyle w:val="Heading2"/>
       </w:pPr>
       <w:r>
@@ -2428,6 +2860,21 @@
       </w:r>
     </w:p>
     <w:p>
+      <w:r>
+        <w:t>| Revisão e explicação contratual | AUTO-0081, AUTO-0082, AUTO-0083, AUTO-0084, AUTO-0085, AUTO-0086, AUTO-0087 | FAQ-AUTO-0078, FAQ-AUTO-0079, FAQ-AUTO-0080, FAQ-AUTO-0081, FAQ-AUTO-0082, FAQ-AUTO-0083, FAQ-AUTO-0084 | DIALOGUE-AUTO-0027, DIALOGUE-AUTO-0028 | CASE-AUTO-0037, CASE-AUTO-0038 |</w:t>
+      </w:r>
+    </w:p>
+    <w:p>
+      <w:r>
+        <w:t>| Dados cadastrais e documentos | AUTO-0088, AUTO-0089, AUTO-0090, AUTO-0091, AUTO-0092, AUTO-0093 | FAQ-AUTO-0085, FAQ-AUTO-0086, FAQ-AUTO-0087, FAQ-AUTO-0088, FAQ-AUTO-0089, FAQ-AUTO-0090 | DIALOGUE-AUTO-0029, DIALOGUE-AUTO-0030 | CASE-AUTO-0039, CASE-AUTO-0040, CASE-AUTO-0041 |</w:t>
+      </w:r>
+    </w:p>
+    <w:p>
+      <w:r>
+        <w:t>| Alterações, renovação e pós-venda | AUTO-0094, AUTO-0095, AUTO-0096, AUTO-0097, AUTO-0098, AUTO-0099, AUTO-0100 | FAQ-AUTO-0091, FAQ-AUTO-0092, FAQ-AUTO-0093, FAQ-AUTO-0094, FAQ-AUTO-0095, FAQ-AUTO-0096, FAQ-AUTO-0097 | DIALOGUE-AUTO-0031, DIALOGUE-AUTO-0032 | CASE-AUTO-0042, CASE-AUTO-0043, CASE-AUTO-0044 |</w:t>
+      </w:r>
+    </w:p>
+    <w:p>
       <w:pPr>
         <w:pStyle w:val="Heading2"/>
       </w:pPr>
@@ -2685,6 +3132,38 @@
     </w:p>
     <w:p>
       <w:pPr>
+        <w:pStyle w:val="ListBullet"/>
+      </w:pPr>
+      <w:r>
+        <w:t>`19_Markdown/AUTO/AUTO_TERMS_0081_0100.md`</w:t>
+      </w:r>
+    </w:p>
+    <w:p>
+      <w:pPr>
+        <w:pStyle w:val="ListBullet"/>
+      </w:pPr>
+      <w:r>
+        <w:t>`19_Markdown/AUTO/AUTO_FAQ_0078_0097.md`</w:t>
+      </w:r>
+    </w:p>
+    <w:p>
+      <w:pPr>
+        <w:pStyle w:val="ListBullet"/>
+      </w:pPr>
+      <w:r>
+        <w:t>`19_Markdown/AUTO/AUTO_DIALOGUES_0027_0032.md`</w:t>
+      </w:r>
+    </w:p>
+    <w:p>
+      <w:pPr>
+        <w:pStyle w:val="ListBullet"/>
+      </w:pPr>
+      <w:r>
+        <w:t>`19_Markdown/AUTO/AUTO_CASES_0037_0044.md`</w:t>
+      </w:r>
+    </w:p>
+    <w:p>
+      <w:pPr>
         <w:pStyle w:val="Heading2"/>
       </w:pPr>
       <w:r>
@@ -2729,6 +3208,11 @@
     <w:p>
       <w:r>
         <w:t>| 2026-06-25 | 0.6 | JP-BR Insurance Knowledge Base | Inclusão dos sétimo e oitavo lotes AUTO. |</w:t>
+      </w:r>
+    </w:p>
+    <w:p>
+      <w:r>
+        <w:t>| 2026-06-25 | 0.7 | JP-BR Insurance Knowledge Base | Inclusão dos nono e décimo lotes AUTO. |</w:t>
       </w:r>
     </w:p>
     <w:sectPr>

</xml_diff>